<commit_message>
Redesign PV mount to 3x4, sync tender package, fix rural-star-sjednica sim pipeline
PV mount redesign (2 supports x 6 modules -> 3 supports x 4 modules, raised
+0,50m -> +1,50m bottom edge) propagated through drawings (S-02/S-03/E-01),
BOQ, and Prilog I; two real bugs found and fixed in tools/rebuild_pdfs.py
(stale duplicate M-01/E-01 pages, obsolete Huawei catalogue reference pages).
tools/check_consistency.py now passes 0 failures across the whole package.

rural-star-sjednica: fixed three real bugs blocking the Radiance pipeline
from ever running (invalid 'box' primitive -> genbox/xform, sensor position
below the raised panel field, silently-discarded return type), added
incremental/resumable CSV output, switched PVLib transposition to Perez,
and added a PVGIS-TMY source option. Config synced to the actual 585W
module and 22kVA genset (was 540W/13.5kW).
</commit_message>
<xml_diff>
--- a/bht-sjednica-final-review/TD-OUTPUT/3. Prilog I TD - Specifikacija zahtjeva.docx
+++ b/bht-sjednica-final-review/TD-OUTPUT/3. Prilog I TD - Specifikacija zahtjeva.docx
@@ -4,26 +4,17 @@
   <w:body>
     <w:p>
       <w:pPr>
-        <w:jc w:val="center"/>
+        <w:pStyle w:val="Title"/>
       </w:pPr>
       <w:r>
-        <w:rPr>
-          <w:b/>
-          <w:color w:val="F5821F"/>
-          <w:sz w:val="30"/>
-        </w:rPr>
         <w:t>PRILOG I TENDERSKOJ DOKUMENTACIJI</w:t>
       </w:r>
     </w:p>
     <w:p>
       <w:pPr>
-        <w:jc w:val="center"/>
+        <w:pStyle w:val="Subtitle"/>
       </w:pPr>
       <w:r>
-        <w:rPr>
-          <w:b/>
-          <w:sz w:val="26"/>
-        </w:rPr>
         <w:t>SPECIFIKACIJA ZAHTJEVA</w:t>
       </w:r>
     </w:p>
@@ -90,6 +81,9 @@
         <w:gridCol w:w="2410"/>
       </w:tblGrid>
       <w:tr>
+        <w:trPr>
+          <w:tblHeader w:val="true"/>
+        </w:trPr>
         <w:tc>
           <w:tcPr>
             <w:tcW w:type="dxa" w:w="1814"/>
@@ -194,7 +188,7 @@
               <w:rPr>
                 <w:sz w:val="17"/>
               </w:rPr>
-              <w:t>projekcija 3236 mm, gornja ivica +3,74 m</w:t>
+              <w:t>projekcija 3236 mm, gornja ivica +3,74 m (v. red niže — sada +4,74 m uz 3×4 konfiguraciju)</w:t>
             </w:r>
           </w:p>
         </w:tc>
@@ -673,6 +667,64 @@
                 <w:sz w:val="17"/>
               </w:rPr>
               <w:t>iskustvo Investitora na lokaciji</w:t>
+            </w:r>
+          </w:p>
+        </w:tc>
+      </w:tr>
+      <w:tr>
+        <w:tc>
+          <w:tcPr>
+            <w:tcW w:type="dxa" w:w="1814"/>
+          </w:tcPr>
+          <w:p>
+            <w:r/>
+            <w:r>
+              <w:rPr>
+                <w:sz w:val="17"/>
+              </w:rPr>
+              <w:t>Konfiguracija nosača</w:t>
+            </w:r>
+          </w:p>
+        </w:tc>
+        <w:tc>
+          <w:tcPr>
+            <w:tcW w:type="dxa" w:w="2268"/>
+          </w:tcPr>
+          <w:p>
+            <w:r/>
+            <w:r>
+              <w:rPr>
+                <w:sz w:val="17"/>
+              </w:rPr>
+              <w:t>2 nosača, 6 modula (2×3), +0,50/+3,74 m, 15,91 m² izloženosti/nosaču</w:t>
+            </w:r>
+          </w:p>
+        </w:tc>
+        <w:tc>
+          <w:tcPr>
+            <w:tcW w:type="dxa" w:w="2494"/>
+          </w:tcPr>
+          <w:p>
+            <w:r/>
+            <w:r>
+              <w:rPr>
+                <w:sz w:val="17"/>
+              </w:rPr>
+              <w:t>3 nosača, 4 modula (2×2), +1,50/+4,74 m, 10,55 m² izloženosti/nosaču — manji presjek dozvoljava veću visinu bez povećanja opterećenja</w:t>
+            </w:r>
+          </w:p>
+        </w:tc>
+        <w:tc>
+          <w:tcPr>
+            <w:tcW w:type="dxa" w:w="2835"/>
+          </w:tcPr>
+          <w:p>
+            <w:r/>
+            <w:r>
+              <w:rPr>
+                <w:sz w:val="17"/>
+              </w:rPr>
+              <w:t>review/07-calculations.md F.6 — custom izrada, kataloški nosač ne zadovoljava ni pri ranijoj ni pri ovoj konfiguraciji</w:t>
             </w:r>
           </w:p>
         </w:tc>
@@ -699,6 +751,9 @@
         <w:gridCol w:w="4819"/>
       </w:tblGrid>
       <w:tr>
+        <w:trPr>
+          <w:tblHeader w:val="true"/>
+        </w:trPr>
         <w:tc>
           <w:tcPr>
             <w:tcW w:type="dxa" w:w="2835"/>
@@ -1055,6 +1110,9 @@
         <w:gridCol w:w="3213"/>
       </w:tblGrid>
       <w:tr>
+        <w:trPr>
+          <w:tblHeader w:val="true"/>
+        </w:trPr>
         <w:tc>
           <w:tcPr>
             <w:tcW w:type="dxa" w:w="1701"/>
@@ -1434,6 +1492,9 @@
         <w:gridCol w:w="4819"/>
       </w:tblGrid>
       <w:tr>
+        <w:trPr>
+          <w:tblHeader w:val="true"/>
+        </w:trPr>
         <w:tc>
           <w:tcPr>
             <w:tcW w:type="dxa" w:w="2494"/>
@@ -1887,6 +1948,9 @@
         <w:gridCol w:w="4819"/>
       </w:tblGrid>
       <w:tr>
+        <w:trPr>
+          <w:tblHeader w:val="true"/>
+        </w:trPr>
         <w:tc>
           <w:tcPr>
             <w:tcW w:type="dxa" w:w="2835"/>
@@ -1945,7 +2009,7 @@
               <w:rPr>
                 <w:sz w:val="17"/>
               </w:rPr>
-              <w:t>2 kom (osnovna izvedba)</w:t>
+              <w:t>3 kom</w:t>
             </w:r>
           </w:p>
         </w:tc>
@@ -1975,7 +2039,7 @@
               <w:rPr>
                 <w:sz w:val="17"/>
               </w:rPr>
-              <w:t>12 × 585 Wp = 7,02 kWp; 6 modula po nosaču, 2 reda × 3 stupca, portret</w:t>
+              <w:t>12 × 585 Wp = 7,02 kWp; 4 modula po nosaču, 2 reda × 2 stupca, portret</w:t>
             </w:r>
           </w:p>
         </w:tc>
@@ -2095,7 +2159,7 @@
               <w:rPr>
                 <w:sz w:val="17"/>
               </w:rPr>
-              <w:t>3476 mm (poprečna greda 4089 mm, bočni prepust 306,5 mm)</w:t>
+              <w:t>2305 mm (poprečna greda 2918 mm, bočni prepust 306,5 mm)</w:t>
             </w:r>
           </w:p>
         </w:tc>
@@ -2185,7 +2249,7 @@
               <w:rPr>
                 <w:sz w:val="17"/>
               </w:rPr>
-              <w:t>+0,50 m / +3,74 m</w:t>
+              <w:t>+1,50 m / +4,74 m</w:t>
             </w:r>
           </w:p>
         </w:tc>
@@ -2215,7 +2279,7 @@
               <w:rPr>
                 <w:sz w:val="17"/>
               </w:rPr>
-              <w:t>1,84 m iznad kote ograde h = 1,90 m</w:t>
+              <w:t>2,84 m iznad kote ograde h = 1,90 m</w:t>
             </w:r>
           </w:p>
         </w:tc>
@@ -2245,7 +2309,7 @@
               <w:rPr>
                 <w:sz w:val="17"/>
               </w:rPr>
-              <w:t>15,91 m² po nosaču</w:t>
+              <w:t>10,55 m² po nosaču</w:t>
             </w:r>
           </w:p>
         </w:tc>
@@ -2261,7 +2325,7 @@
               <w:rPr>
                 <w:sz w:val="17"/>
               </w:rPr>
-              <w:t>Referentni proizvod</w:t>
+              <w:t>Referentna izvedba</w:t>
             </w:r>
           </w:p>
         </w:tc>
@@ -2275,7 +2339,7 @@
               <w:rPr>
                 <w:sz w:val="17"/>
               </w:rPr>
-              <w:t>Huawei Standard A-shaped Support 3.0 LOW, BOM 21540481, ankeri 21540482 — ili ekvivalent koji zadovoljava Tačku 3.2</w:t>
+              <w:t>CUSTOM IZRADA čeličnog nosača po opterećenju iz Tačke 3.2 — nijedan kataloški proizvod (npr. Huawei Standard A-shaped Support 3.0) ne zadovoljava opterećenje vjetrom na ovoj lokaciji ni pri ovoj, manjoj površini nosača</w:t>
             </w:r>
           </w:p>
         </w:tc>
@@ -2305,15 +2369,19 @@
     </w:p>
     <w:p>
       <w:pPr>
-        <w:spacing w:after="80"/>
+        <w:spacing w:before="80" w:after="120"/>
+        <w:shd w:fill="FCEEDD"/>
+        <w:pBdr>
+          <w:left w:val="single" w:sz="18" w:space="4" w:color="F5821F"/>
+        </w:pBdr>
+        <w:ind w:left="160"/>
       </w:pPr>
       <w:r>
         <w:rPr>
           <w:b/>
-          <w:i w:val="0"/>
           <w:sz w:val="19"/>
         </w:rPr>
-        <w:t>UPOZORENJE: kataloški nosač tipa A ima deklarisanu otpornost 31 m/s (0,52 kN/m²) pri nagibu 45° i 40 m/s (0,87 kN/m²) pri 15°/25°, što je ISPOD opterećenja ovog lokaliteta. Nijedan standardni nagib kataloškog proizvoda ne zadovoljava. Ponuđač je dužan ponuditi konstrukciju dimenzionisanu i dokazanu za stvarno opterećenje lokaliteta.</w:t>
+        <w:t>OSNOVA PRORAČUNA: kataloški nosač tipa A ima deklarisanu otpornost 31 m/s (0,52 kN/m²) pri nagibu 45° i 40 m/s (0,87 kN/m²) pri 15°/25°, što je ISPOD opterećenja ovog lokaliteta — i pri punoj (2×6) i pri ovoj, manjoj (3×4) površini nosača. Zahtijeva se CUSTOM IZRADA konstrukcije dimenzionisane i dokazane za stvarno opterećenje lokaliteta (Tačka 3.1); kataloški proizvod se ne prihvata kao osnovna ponuda.</w:t>
       </w:r>
     </w:p>
     <w:tbl>
@@ -2328,6 +2396,9 @@
         <w:gridCol w:w="4819"/>
       </w:tblGrid>
       <w:tr>
+        <w:trPr>
+          <w:tblHeader w:val="true"/>
+        </w:trPr>
         <w:tc>
           <w:tcPr>
             <w:tcW w:type="dxa" w:w="3061"/>
@@ -2432,7 +2503,7 @@
               <w:rPr>
                 <w:sz w:val="17"/>
               </w:rPr>
-              <w:t>Sila podizanja po nosaču</w:t>
+              <w:t>Površina izloženosti vjetru</w:t>
             </w:r>
           </w:p>
         </w:tc>
@@ -2446,7 +2517,7 @@
               <w:rPr>
                 <w:sz w:val="17"/>
               </w:rPr>
-              <w:t>≥27 kN (GSN, γQ = 1,5 / γG,fav = 0,9)</w:t>
+              <w:t>10,55 m² po nosaču</w:t>
             </w:r>
           </w:p>
         </w:tc>
@@ -2462,7 +2533,7 @@
               <w:rPr>
                 <w:sz w:val="17"/>
               </w:rPr>
-              <w:t>Horizontalna sila po nosaču</w:t>
+              <w:t>Sila podizanja po nosaču</w:t>
             </w:r>
           </w:p>
         </w:tc>
@@ -2476,7 +2547,7 @@
               <w:rPr>
                 <w:sz w:val="17"/>
               </w:rPr>
-              <w:t>≥30 kN (GSN)</w:t>
+              <w:t>≥18,1 kN (GSN, γQ = 1,5 / γG,fav = 0,9)</w:t>
             </w:r>
           </w:p>
         </w:tc>
@@ -2492,7 +2563,7 @@
               <w:rPr>
                 <w:sz w:val="17"/>
               </w:rPr>
-              <w:t>Moment prevrtanja po nosaču</w:t>
+              <w:t>Horizontalna sila po nosaču</w:t>
             </w:r>
           </w:p>
         </w:tc>
@@ -2506,7 +2577,7 @@
               <w:rPr>
                 <w:sz w:val="17"/>
               </w:rPr>
-              <w:t>≥64 kNm (GSN)</w:t>
+              <w:t>≥13,4 kN (GSN)</w:t>
             </w:r>
           </w:p>
         </w:tc>
@@ -2522,7 +2593,7 @@
               <w:rPr>
                 <w:sz w:val="17"/>
               </w:rPr>
-              <w:t>Mjerodavno</w:t>
+              <w:t>Moment prevrtanja po nosaču</w:t>
             </w:r>
           </w:p>
         </w:tc>
@@ -2536,7 +2607,7 @@
               <w:rPr>
                 <w:sz w:val="17"/>
               </w:rPr>
-              <w:t>podizanje (uplift) i prevrtanje, a NE nosivost tla</w:t>
+              <w:t>≥62,8 kNm (GSN)</w:t>
             </w:r>
           </w:p>
         </w:tc>
@@ -2552,7 +2623,7 @@
               <w:rPr>
                 <w:sz w:val="17"/>
               </w:rPr>
-              <w:t>Potvrda proizvođača</w:t>
+              <w:t>Mjerodavno</w:t>
             </w:r>
           </w:p>
         </w:tc>
@@ -2566,7 +2637,7 @@
               <w:rPr>
                 <w:sz w:val="17"/>
               </w:rPr>
-              <w:t>pisana potvrda za konkretnu lokaciju (planinski vrh), ako se nudi kataloški proizvod</w:t>
+              <w:t>podizanje (uplift) i prevrtanje, a NE nosivost tla</w:t>
             </w:r>
           </w:p>
         </w:tc>
@@ -2593,6 +2664,9 @@
         <w:gridCol w:w="4819"/>
       </w:tblGrid>
       <w:tr>
+        <w:trPr>
+          <w:tblHeader w:val="true"/>
+        </w:trPr>
         <w:tc>
           <w:tcPr>
             <w:tcW w:type="dxa" w:w="2494"/>
@@ -2918,6 +2992,9 @@
         <w:gridCol w:w="4819"/>
       </w:tblGrid>
       <w:tr>
+        <w:trPr>
+          <w:tblHeader w:val="true"/>
+        </w:trPr>
         <w:tc>
           <w:tcPr>
             <w:tcW w:type="dxa" w:w="2268"/>
@@ -3112,7 +3189,7 @@
               <w:rPr>
                 <w:sz w:val="17"/>
               </w:rPr>
-              <w:t>Dokazivanje</w:t>
+              <w:t>Projektna sila</w:t>
             </w:r>
           </w:p>
         </w:tc>
@@ -3126,7 +3203,7 @@
               <w:rPr>
                 <w:sz w:val="17"/>
               </w:rPr>
-              <w:t>ispitivanje čupanjem na ≥10 % ugrađenih ankera, min. 2 po nosaču, do 1,5 × projektne sile, uz zapisnik ovjeren od nadzornog organa</w:t>
+              <w:t>ukupno podizanje po nosaču ≥18,1 kN; sila po traci od momenta prevrtanja ≥39,3 kN pri razmaku traka 1600 mm — ovo je mjerodavno opterećenje za sidrenje, ne ukupno podizanje</w:t>
             </w:r>
           </w:p>
         </w:tc>
@@ -3142,6 +3219,36 @@
               <w:rPr>
                 <w:sz w:val="17"/>
               </w:rPr>
+              <w:t>Dokazivanje</w:t>
+            </w:r>
+          </w:p>
+        </w:tc>
+        <w:tc>
+          <w:tcPr>
+            <w:tcW w:type="dxa" w:w="7143"/>
+          </w:tcPr>
+          <w:p>
+            <w:r/>
+            <w:r>
+              <w:rPr>
+                <w:sz w:val="17"/>
+              </w:rPr>
+              <w:t>ispitivanje čupanjem na ≥10 % ugrađenih ankera, min. 2 po nosaču, do 1,5 × projektne sile, uz zapisnik ovjeren od nadzornog organa</w:t>
+            </w:r>
+          </w:p>
+        </w:tc>
+      </w:tr>
+      <w:tr>
+        <w:tc>
+          <w:tcPr>
+            <w:tcW w:type="dxa" w:w="2268"/>
+          </w:tcPr>
+          <w:p>
+            <w:r/>
+            <w:r>
+              <w:rPr>
+                <w:sz w:val="17"/>
+              </w:rPr>
               <w:t>Alternativa</w:t>
             </w:r>
           </w:p>
@@ -3156,7 +3263,7 @@
               <w:rPr>
                 <w:sz w:val="17"/>
               </w:rPr>
-              <w:t>livena U-sidra M16/320 dozvoljena SAMO uz gravitacioni temelj ≥1,14 m³ po nosaču</w:t>
+              <w:t>livena U-sidra M16/320 dozvoljena SAMO uz gravitacioni temelj ≥0,75 m³ po nosaču — momenat prevrtanja i dalje zahtijeva provjeru lokalnog istezanja trake, ne samo ukupne mase</w:t>
             </w:r>
           </w:p>
         </w:tc>
@@ -3183,6 +3290,9 @@
         <w:gridCol w:w="4819"/>
       </w:tblGrid>
       <w:tr>
+        <w:trPr>
+          <w:tblHeader w:val="true"/>
+        </w:trPr>
         <w:tc>
           <w:tcPr>
             <w:tcW w:type="dxa" w:w="2268"/>
@@ -3331,7 +3441,7 @@
               <w:rPr>
                 <w:sz w:val="17"/>
               </w:rPr>
-              <w:t>2 trake po nosaču, min. 450 mm široke × 3300 mm duge, razmak 2600 mm, pravac SJEVER–JUG; dubina prema statičkom proračunu (≥900 mm)</w:t>
+              <w:t>2 trake po nosaču (×3 nosača = 6 traka ukupno), min. 450 mm široke × 3300 mm duge, razmak 1600 mm, pravac SJEVER–JUG; dubina prema statičkom proračunu (≥900 mm)</w:t>
             </w:r>
           </w:p>
         </w:tc>
@@ -3361,7 +3471,7 @@
               <w:rPr>
                 <w:sz w:val="17"/>
               </w:rPr>
-              <w:t>IZVAN ograđenog platoa, 1400 mm južno od kote ograde</w:t>
+              <w:t>IZVAN ograđenog platoa, 400 mm južno od kote ograde</w:t>
             </w:r>
           </w:p>
         </w:tc>
@@ -3428,7 +3538,7 @@
         <w:rPr>
           <w:sz w:val="19"/>
         </w:rPr>
-        <w:t>povezivanje oba nosača na postojeći prstenasti uzemljivač Fe/Zn 25 × 4 mm</w:t>
+        <w:t>povezivanje sva tri nosača na postojeći prstenasti uzemljivač Fe/Zn 25 × 4 mm</w:t>
       </w:r>
     </w:p>
     <w:p>
@@ -3481,27 +3591,6 @@
     </w:p>
     <w:p>
       <w:pPr>
-        <w:pStyle w:val="Heading2"/>
-      </w:pPr>
-      <w:r>
-        <w:t>3.7 Opcija: tri nosača sa po 4 modula</w:t>
-      </w:r>
-    </w:p>
-    <w:p>
-      <w:pPr>
-        <w:spacing w:after="80"/>
-      </w:pPr>
-      <w:r>
-        <w:rPr>
-          <w:b w:val="0"/>
-          <w:i w:val="0"/>
-          <w:sz w:val="19"/>
-        </w:rPr>
-        <w:t>Ponuđač može, kao alternativu, ponuditi TRI nosača sa po 4 modula (3 × 4 = 12 modula, ista snaga 7,02 kWp). Površina izloženosti vjetru po nosaču smanjuje se sa 15,91 m² na 7,95 m² (−50 %), čime se približno prepolovljuju sila podizanja i moment prevrtanja po temelju, uz zadržavanje nagiba 45°. Cijena se iskazuje posebno (Prilog II, Tačka 1.8). Kupac zadržava pravo izbora.</w:t>
-      </w:r>
-    </w:p>
-    <w:p>
-      <w:pPr>
         <w:pStyle w:val="Heading1"/>
       </w:pPr>
       <w:r>
@@ -3528,6 +3617,9 @@
         <w:gridCol w:w="4819"/>
       </w:tblGrid>
       <w:tr>
+        <w:trPr>
+          <w:tblHeader w:val="true"/>
+        </w:trPr>
         <w:tc>
           <w:tcPr>
             <w:tcW w:type="dxa" w:w="2608"/>
@@ -3976,6 +4068,9 @@
         <w:gridCol w:w="4819"/>
       </w:tblGrid>
       <w:tr>
+        <w:trPr>
+          <w:tblHeader w:val="true"/>
+        </w:trPr>
         <w:tc>
           <w:tcPr>
             <w:tcW w:type="dxa" w:w="2608"/>
@@ -4301,6 +4396,9 @@
         <w:gridCol w:w="4819"/>
       </w:tblGrid>
       <w:tr>
+        <w:trPr>
+          <w:tblHeader w:val="true"/>
+        </w:trPr>
         <w:tc>
           <w:tcPr>
             <w:tcW w:type="dxa" w:w="2608"/>
@@ -4586,12 +4684,16 @@
     </w:p>
     <w:p>
       <w:pPr>
-        <w:spacing w:after="80"/>
+        <w:spacing w:before="80" w:after="120"/>
+        <w:shd w:fill="FCEEDD"/>
+        <w:pBdr>
+          <w:left w:val="single" w:sz="18" w:space="4" w:color="F5821F"/>
+        </w:pBdr>
+        <w:ind w:left="160"/>
       </w:pPr>
       <w:r>
         <w:rPr>
           <w:b/>
-          <w:i w:val="0"/>
           <w:sz w:val="19"/>
         </w:rPr>
         <w:t>KRITIČNO — POBUDA GENERATORA. Referentni agregat je u standardnoj izvedbi SHUNT pobude, za koju tehnički list proizvođača deklariše trajnu struju kratkog spoja 0 % (nezavisna pobuda PMG / AUX je opcija). Kod SHUNT pobude napon na stezaljkama se pri kvaru uruši, pobuda nestaje, a trajna struja kvara padne na ≈0,5 × In — ISPOD nazivne struje, pa ne može aktivirati nijednu prekostrujnu zaštitu. Zbog toga se zahtijeva NEZAVISNA POBUDA (PMG ili AREP/AUX) sa 3 × In u trajanju ≥10 s (Tačka 4.1), a zaštita zaštitnom strujnom sklopkom ostaje OBAVEZNA kao drugi nivo zaštite.</w:t>
@@ -4609,6 +4711,9 @@
         <w:gridCol w:w="4819"/>
       </w:tblGrid>
       <w:tr>
+        <w:trPr>
+          <w:tblHeader w:val="true"/>
+        </w:trPr>
         <w:tc>
           <w:tcPr>
             <w:tcW w:type="dxa" w:w="2608"/>
@@ -5192,12 +5297,16 @@
     </w:p>
     <w:p>
       <w:pPr>
-        <w:spacing w:after="80"/>
+        <w:spacing w:before="80" w:after="120"/>
+        <w:shd w:fill="FCEEDD"/>
+        <w:pBdr>
+          <w:left w:val="single" w:sz="18" w:space="4" w:color="F5821F"/>
+        </w:pBdr>
+        <w:ind w:left="160"/>
       </w:pPr>
       <w:r>
         <w:rPr>
           <w:b/>
-          <w:i w:val="0"/>
           <w:sz w:val="19"/>
         </w:rPr>
         <w:t>Ponuda koja ne sadrži dokaze označene kao OBAVEZNI smatra se neprihvatljivom. Dokazi se NE dostavljaju naknadno, nakon dodjele ugovora.</w:t>
@@ -5217,6 +5326,9 @@
         <w:gridCol w:w="2410"/>
       </w:tblGrid>
       <w:tr>
+        <w:trPr>
+          <w:tblHeader w:val="true"/>
+        </w:trPr>
         <w:tc>
           <w:tcPr>
             <w:tcW w:type="dxa" w:w="680"/>
@@ -5597,7 +5709,7 @@
               <w:rPr>
                 <w:sz w:val="17"/>
               </w:rPr>
-              <w:t>Pisana potvrda proizvođača nosača za konkretnu lokaciju (planinski vrh), ako se nudi kataloški proizvod</w:t>
+              <w:t>Tehnički list (TDS) ponuđenog agregata sa podacima o hlađenju, izduvu i masama</w:t>
             </w:r>
           </w:p>
         </w:tc>
@@ -5611,7 +5723,7 @@
               <w:rPr>
                 <w:sz w:val="17"/>
               </w:rPr>
-              <w:t>1</w:t>
+              <w:t>2</w:t>
             </w:r>
           </w:p>
         </w:tc>
@@ -5655,7 +5767,7 @@
               <w:rPr>
                 <w:sz w:val="17"/>
               </w:rPr>
-              <w:t>Tehnički list (TDS) ponuđenog agregata sa podacima o hlađenju, izduvu i masama</w:t>
+              <w:t>Proračun ventilacije sa padom pritiska ukupne putanje (≤125 Pa)</w:t>
             </w:r>
           </w:p>
         </w:tc>
@@ -5713,7 +5825,7 @@
               <w:rPr>
                 <w:sz w:val="17"/>
               </w:rPr>
-              <w:t>Proračun ventilacije sa padom pritiska ukupne putanje (≤125 Pa)</w:t>
+              <w:t>Proračun protutlaka izduvnog sistema</w:t>
             </w:r>
           </w:p>
         </w:tc>
@@ -5771,7 +5883,7 @@
               <w:rPr>
                 <w:sz w:val="17"/>
               </w:rPr>
-              <w:t>Proračun protutlaka izduvnog sistema</w:t>
+              <w:t>Proračun nosivosti poda kontejnera za skid i pun spremnik</w:t>
             </w:r>
           </w:p>
         </w:tc>
@@ -5829,7 +5941,7 @@
               <w:rPr>
                 <w:sz w:val="17"/>
               </w:rPr>
-              <w:t>Proračun nosivosti poda kontejnera za skid i pun spremnik</w:t>
+              <w:t>Jednopolna shema novog GRO sa zaštitnim uređajima</w:t>
             </w:r>
           </w:p>
         </w:tc>
@@ -5887,7 +5999,7 @@
               <w:rPr>
                 <w:sz w:val="17"/>
               </w:rPr>
-              <w:t>Jednopolna shema novog GRO sa zaštitnim uređajima</w:t>
+              <w:t>Ovlaštenje proizvođača ili ovlaštenog distributera za ponuđeni agregat</w:t>
             </w:r>
           </w:p>
         </w:tc>
@@ -5945,7 +6057,7 @@
               <w:rPr>
                 <w:sz w:val="17"/>
               </w:rPr>
-              <w:t>Ovlaštenje proizvođača ili ovlaštenog distributera za ponuđeni agregat</w:t>
+              <w:t>ISO 9001 i ISO 14001 proizvođača agregata</w:t>
             </w:r>
           </w:p>
         </w:tc>
@@ -6003,7 +6115,7 @@
               <w:rPr>
                 <w:sz w:val="17"/>
               </w:rPr>
-              <w:t>ISO 9001 i ISO 14001 proizvođača agregata</w:t>
+              <w:t>Kataloška dokumentacija sa označenim ponuđenim tipovima</w:t>
             </w:r>
           </w:p>
         </w:tc>
@@ -6017,7 +6129,7 @@
               <w:rPr>
                 <w:sz w:val="17"/>
               </w:rPr>
-              <w:t>2</w:t>
+              <w:t>1, 2</w:t>
             </w:r>
           </w:p>
         </w:tc>
@@ -6048,64 +6160,6 @@
                 <w:sz w:val="17"/>
               </w:rPr>
               <w:t>14</w:t>
-            </w:r>
-          </w:p>
-        </w:tc>
-        <w:tc>
-          <w:tcPr>
-            <w:tcW w:type="dxa" w:w="5443"/>
-          </w:tcPr>
-          <w:p>
-            <w:r/>
-            <w:r>
-              <w:rPr>
-                <w:sz w:val="17"/>
-              </w:rPr>
-              <w:t>Kataloška dokumentacija sa označenim ponuđenim tipovima</w:t>
-            </w:r>
-          </w:p>
-        </w:tc>
-        <w:tc>
-          <w:tcPr>
-            <w:tcW w:type="dxa" w:w="907"/>
-          </w:tcPr>
-          <w:p>
-            <w:r/>
-            <w:r>
-              <w:rPr>
-                <w:sz w:val="17"/>
-              </w:rPr>
-              <w:t>1, 2</w:t>
-            </w:r>
-          </w:p>
-        </w:tc>
-        <w:tc>
-          <w:tcPr>
-            <w:tcW w:type="dxa" w:w="2381"/>
-          </w:tcPr>
-          <w:p>
-            <w:r/>
-            <w:r>
-              <w:rPr>
-                <w:sz w:val="17"/>
-              </w:rPr>
-              <w:t>OBAVEZNO</w:t>
-            </w:r>
-          </w:p>
-        </w:tc>
-      </w:tr>
-      <w:tr>
-        <w:tc>
-          <w:tcPr>
-            <w:tcW w:type="dxa" w:w="680"/>
-          </w:tcPr>
-          <w:p>
-            <w:r/>
-            <w:r>
-              <w:rPr>
-                <w:sz w:val="17"/>
-              </w:rPr>
-              <w:t>15</w:t>
             </w:r>
           </w:p>
         </w:tc>
@@ -6174,6 +6228,9 @@
         <w:gridCol w:w="4819"/>
       </w:tblGrid>
       <w:tr>
+        <w:trPr>
+          <w:tblHeader w:val="true"/>
+        </w:trPr>
         <w:tc>
           <w:tcPr>
             <w:tcW w:type="dxa" w:w="3402"/>
@@ -6545,7 +6602,56 @@
         <w:color w:val="595959"/>
         <w:sz w:val="15"/>
       </w:rPr>
-      <w:t>PRILOG I — Specifikacija zahtjeva · BS Sjednica (Bileća) · Rev. 1, 2026</w:t>
+      <w:t xml:space="preserve">PRILOG I — Specifikacija zahtjeva · BS Sjednica (Bileća) · Rev. 1, 2026 · stranica </w:t>
+    </w:r>
+    <w:r>
+      <w:rPr>
+        <w:color w:val="595959"/>
+        <w:sz w:val="15"/>
+      </w:rPr>
+      <w:fldChar w:fldCharType="begin"/>
+    </w:r>
+    <w:r>
+      <w:rPr>
+        <w:color w:val="595959"/>
+        <w:sz w:val="15"/>
+      </w:rPr>
+      <w:instrText xml:space="preserve">PAGE</w:instrText>
+    </w:r>
+    <w:r>
+      <w:rPr>
+        <w:color w:val="595959"/>
+        <w:sz w:val="15"/>
+      </w:rPr>
+      <w:fldChar w:fldCharType="end"/>
+    </w:r>
+    <w:r>
+      <w:rPr>
+        <w:color w:val="595959"/>
+        <w:sz w:val="15"/>
+      </w:rPr>
+      <w:t xml:space="preserve"> od </w:t>
+    </w:r>
+    <w:r>
+      <w:rPr>
+        <w:color w:val="595959"/>
+        <w:sz w:val="15"/>
+      </w:rPr>
+      <w:fldChar w:fldCharType="begin"/>
+    </w:r>
+    <w:r>
+      <w:rPr>
+        <w:color w:val="595959"/>
+        <w:sz w:val="15"/>
+      </w:rPr>
+      <w:instrText xml:space="preserve">NUMPAGES</w:instrText>
+    </w:r>
+    <w:r>
+      <w:rPr>
+        <w:color w:val="595959"/>
+        <w:sz w:val="15"/>
+      </w:rPr>
+      <w:fldChar w:fldCharType="end"/>
     </w:r>
   </w:p>
 </w:ftr>
@@ -7312,15 +7418,17 @@
       <w:pBdr>
         <w:bottom w:val="single" w:sz="8" w:space="4" w:color="4F81BD" w:themeColor="accent1"/>
       </w:pBdr>
-      <w:spacing w:after="300" w:line="240" w:lineRule="auto"/>
+      <w:spacing w:after="40" w:line="240" w:lineRule="auto"/>
       <w:contextualSpacing/>
+      <w:jc w:val="center"/>
     </w:pPr>
     <w:rPr>
-      <w:rFonts w:asciiTheme="majorHAnsi" w:eastAsiaTheme="majorEastAsia" w:hAnsiTheme="majorHAnsi" w:cstheme="majorBidi"/>
-      <w:color w:val="17365D" w:themeColor="text2" w:themeShade="BF"/>
+      <w:rFonts w:asciiTheme="majorHAnsi" w:eastAsiaTheme="majorEastAsia" w:hAnsiTheme="majorHAnsi" w:cstheme="majorBidi" w:ascii="Arial" w:hAnsi="Arial"/>
+      <w:b/>
+      <w:color w:val="F5821F"/>
       <w:spacing w:val="5"/>
       <w:kern w:val="28"/>
-      <w:sz w:val="52"/>
+      <w:sz w:val="30"/>
       <w:szCs w:val="52"/>
     </w:rPr>
   </w:style>
@@ -7351,14 +7459,17 @@
       <w:numPr>
         <w:ilvl w:val="1"/>
       </w:numPr>
+      <w:spacing w:after="80"/>
+      <w:jc w:val="center"/>
     </w:pPr>
     <w:rPr>
-      <w:rFonts w:asciiTheme="majorHAnsi" w:eastAsiaTheme="majorEastAsia" w:hAnsiTheme="majorHAnsi" w:cstheme="majorBidi"/>
+      <w:rFonts w:asciiTheme="majorHAnsi" w:eastAsiaTheme="majorEastAsia" w:hAnsiTheme="majorHAnsi" w:cstheme="majorBidi" w:ascii="Arial" w:hAnsi="Arial"/>
+      <w:b/>
       <w:i/>
       <w:iCs/>
-      <w:color w:val="4F81BD" w:themeColor="accent1"/>
+      <w:color w:val="000000"/>
       <w:spacing w:val="15"/>
-      <w:sz w:val="24"/>
+      <w:sz w:val="26"/>
       <w:szCs w:val="24"/>
     </w:rPr>
   </w:style>

</xml_diff>

<commit_message>
Add genset and fuel-tank figures to Prilog I
New tools/render_equipment.py renders print-ready views: genset from the
reference wireframe PNGs (inverted to black-on-white, vendor view labels
trimmed), 500 l tank from the vendor vector PDFs at 300 DPI. The vendor
"P_22-6_*" PDFs actually contain tank geometry - mapping is documented in
the script.

make_prilog1.py gains a figures() helper (side-by-side pairs with centred
italic captions) and places Slika 1-2 under 4.1 Agregat and Slika 3-4
under 4.2 Spremnik goriva, captioned generically "(ilustrativno)" to keep
the tender brand-neutral. check_consistency.py: 0 failures.

Co-Authored-By: Claude Fable 5 <noreply@anthropic.com>
Claude-Session: https://claude.ai/code/session_01V43Ak6nLcsktiGT9kPUEQu
</commit_message>
<xml_diff>
--- a/bht-sjednica-final-review/TD-OUTPUT/3. Prilog I TD - Specifikacija zahtjeva.docx
+++ b/bht-sjednica-final-review/TD-OUTPUT/3. Prilog I TD - Specifikacija zahtjeva.docx
@@ -3955,6 +3955,134 @@
       </w:tr>
     </w:tbl>
     <w:p/>
+    <w:tbl>
+      <w:tblPr>
+        <w:tblW w:type="auto" w:w="0"/>
+        <w:jc w:val="center"/>
+        <w:tblLook w:firstColumn="1" w:firstRow="1" w:lastColumn="0" w:lastRow="0" w:noHBand="0" w:noVBand="1" w:val="04A0"/>
+      </w:tblPr>
+      <w:tblGrid>
+        <w:gridCol w:w="4819"/>
+        <w:gridCol w:w="4819"/>
+      </w:tblGrid>
+      <w:tr>
+        <w:tc>
+          <w:tcPr>
+            <w:tcW w:type="dxa" w:w="4819"/>
+          </w:tcPr>
+          <w:p>
+            <w:pPr>
+              <w:jc w:val="center"/>
+            </w:pPr>
+            <w:r>
+              <w:drawing>
+                <wp:inline xmlns:a="http://schemas.openxmlformats.org/drawingml/2006/main" xmlns:pic="http://schemas.openxmlformats.org/drawingml/2006/picture">
+                  <wp:extent cx="3311999" cy="2732399"/>
+                  <wp:docPr id="1" name="Picture 1"/>
+                  <wp:cNvGraphicFramePr>
+                    <a:graphicFrameLocks noChangeAspect="1"/>
+                  </wp:cNvGraphicFramePr>
+                  <a:graphic>
+                    <a:graphicData uri="http://schemas.openxmlformats.org/drawingml/2006/picture">
+                      <pic:pic>
+                        <pic:nvPicPr>
+                          <pic:cNvPr id="0" name="genset_side.png"/>
+                          <pic:cNvPicPr/>
+                        </pic:nvPicPr>
+                        <pic:blipFill>
+                          <a:blip r:embed="rId11"/>
+                          <a:stretch>
+                            <a:fillRect/>
+                          </a:stretch>
+                        </pic:blipFill>
+                        <pic:spPr>
+                          <a:xfrm>
+                            <a:off x="0" y="0"/>
+                            <a:ext cx="3311999" cy="2732399"/>
+                          </a:xfrm>
+                          <a:prstGeom prst="rect"/>
+                        </pic:spPr>
+                      </pic:pic>
+                    </a:graphicData>
+                  </a:graphic>
+                </wp:inline>
+              </w:drawing>
+            </w:r>
+          </w:p>
+          <w:p>
+            <w:pPr>
+              <w:spacing w:before="40"/>
+              <w:jc w:val="center"/>
+            </w:pPr>
+            <w:r>
+              <w:rPr>
+                <w:i/>
+                <w:sz w:val="17"/>
+              </w:rPr>
+              <w:t>Slika 1 — Dizel električni agregat 22 kVA u skid izvedbi, bočni izgled (ilustrativno)</w:t>
+            </w:r>
+          </w:p>
+        </w:tc>
+        <w:tc>
+          <w:tcPr>
+            <w:tcW w:type="dxa" w:w="4819"/>
+          </w:tcPr>
+          <w:p>
+            <w:pPr>
+              <w:jc w:val="center"/>
+            </w:pPr>
+            <w:r>
+              <w:drawing>
+                <wp:inline xmlns:a="http://schemas.openxmlformats.org/drawingml/2006/main" xmlns:pic="http://schemas.openxmlformats.org/drawingml/2006/picture">
+                  <wp:extent cx="1728000" cy="2528780"/>
+                  <wp:docPr id="2" name="Picture 2"/>
+                  <wp:cNvGraphicFramePr>
+                    <a:graphicFrameLocks noChangeAspect="1"/>
+                  </wp:cNvGraphicFramePr>
+                  <a:graphic>
+                    <a:graphicData uri="http://schemas.openxmlformats.org/drawingml/2006/picture">
+                      <pic:pic>
+                        <pic:nvPicPr>
+                          <pic:cNvPr id="0" name="genset_front.png"/>
+                          <pic:cNvPicPr/>
+                        </pic:nvPicPr>
+                        <pic:blipFill>
+                          <a:blip r:embed="rId12"/>
+                          <a:stretch>
+                            <a:fillRect/>
+                          </a:stretch>
+                        </pic:blipFill>
+                        <pic:spPr>
+                          <a:xfrm>
+                            <a:off x="0" y="0"/>
+                            <a:ext cx="1728000" cy="2528780"/>
+                          </a:xfrm>
+                          <a:prstGeom prst="rect"/>
+                        </pic:spPr>
+                      </pic:pic>
+                    </a:graphicData>
+                  </a:graphic>
+                </wp:inline>
+              </w:drawing>
+            </w:r>
+          </w:p>
+          <w:p>
+            <w:pPr>
+              <w:spacing w:before="40"/>
+              <w:jc w:val="center"/>
+            </w:pPr>
+            <w:r>
+              <w:rPr>
+                <w:i/>
+                <w:sz w:val="17"/>
+              </w:rPr>
+              <w:t>Slika 2 — Agregat, čeoni izgled sa strane hladnjaka (ilustrativno)</w:t>
+            </w:r>
+          </w:p>
+        </w:tc>
+      </w:tr>
+    </w:tbl>
+    <w:p/>
     <w:p>
       <w:pPr>
         <w:pStyle w:val="Heading2"/>
@@ -4035,6 +4163,134 @@
         <w:t>sifon protiv povratnog toka</w:t>
       </w:r>
     </w:p>
+    <w:tbl>
+      <w:tblPr>
+        <w:tblW w:type="auto" w:w="0"/>
+        <w:jc w:val="center"/>
+        <w:tblLook w:firstColumn="1" w:firstRow="1" w:lastColumn="0" w:lastRow="0" w:noHBand="0" w:noVBand="1" w:val="04A0"/>
+      </w:tblPr>
+      <w:tblGrid>
+        <w:gridCol w:w="4819"/>
+        <w:gridCol w:w="4819"/>
+      </w:tblGrid>
+      <w:tr>
+        <w:tc>
+          <w:tcPr>
+            <w:tcW w:type="dxa" w:w="4819"/>
+          </w:tcPr>
+          <w:p>
+            <w:pPr>
+              <w:jc w:val="center"/>
+            </w:pPr>
+            <w:r>
+              <w:drawing>
+                <wp:inline xmlns:a="http://schemas.openxmlformats.org/drawingml/2006/main" xmlns:pic="http://schemas.openxmlformats.org/drawingml/2006/picture">
+                  <wp:extent cx="2664000" cy="2660331"/>
+                  <wp:docPr id="3" name="Picture 3"/>
+                  <wp:cNvGraphicFramePr>
+                    <a:graphicFrameLocks noChangeAspect="1"/>
+                  </wp:cNvGraphicFramePr>
+                  <a:graphic>
+                    <a:graphicData uri="http://schemas.openxmlformats.org/drawingml/2006/picture">
+                      <pic:pic>
+                        <pic:nvPicPr>
+                          <pic:cNvPr id="0" name="tank_side.png"/>
+                          <pic:cNvPicPr/>
+                        </pic:nvPicPr>
+                        <pic:blipFill>
+                          <a:blip r:embed="rId13"/>
+                          <a:stretch>
+                            <a:fillRect/>
+                          </a:stretch>
+                        </pic:blipFill>
+                        <pic:spPr>
+                          <a:xfrm>
+                            <a:off x="0" y="0"/>
+                            <a:ext cx="2664000" cy="2660331"/>
+                          </a:xfrm>
+                          <a:prstGeom prst="rect"/>
+                        </pic:spPr>
+                      </pic:pic>
+                    </a:graphicData>
+                  </a:graphic>
+                </wp:inline>
+              </w:drawing>
+            </w:r>
+          </w:p>
+          <w:p>
+            <w:pPr>
+              <w:spacing w:before="40"/>
+              <w:jc w:val="center"/>
+            </w:pPr>
+            <w:r>
+              <w:rPr>
+                <w:i/>
+                <w:sz w:val="17"/>
+              </w:rPr>
+              <w:t>Slika 3 — Spremnik goriva 500 l, bočni izgled sa pretakačkom opremom (ilustrativno)</w:t>
+            </w:r>
+          </w:p>
+        </w:tc>
+        <w:tc>
+          <w:tcPr>
+            <w:tcW w:type="dxa" w:w="4819"/>
+          </w:tcPr>
+          <w:p>
+            <w:pPr>
+              <w:jc w:val="center"/>
+            </w:pPr>
+            <w:r>
+              <w:drawing>
+                <wp:inline xmlns:a="http://schemas.openxmlformats.org/drawingml/2006/main" xmlns:pic="http://schemas.openxmlformats.org/drawingml/2006/picture">
+                  <wp:extent cx="3096000" cy="2029514"/>
+                  <wp:docPr id="4" name="Picture 4"/>
+                  <wp:cNvGraphicFramePr>
+                    <a:graphicFrameLocks noChangeAspect="1"/>
+                  </wp:cNvGraphicFramePr>
+                  <a:graphic>
+                    <a:graphicData uri="http://schemas.openxmlformats.org/drawingml/2006/picture">
+                      <pic:pic>
+                        <pic:nvPicPr>
+                          <pic:cNvPr id="0" name="tank_top.png"/>
+                          <pic:cNvPicPr/>
+                        </pic:nvPicPr>
+                        <pic:blipFill>
+                          <a:blip r:embed="rId14"/>
+                          <a:stretch>
+                            <a:fillRect/>
+                          </a:stretch>
+                        </pic:blipFill>
+                        <pic:spPr>
+                          <a:xfrm>
+                            <a:off x="0" y="0"/>
+                            <a:ext cx="3096000" cy="2029514"/>
+                          </a:xfrm>
+                          <a:prstGeom prst="rect"/>
+                        </pic:spPr>
+                      </pic:pic>
+                    </a:graphicData>
+                  </a:graphic>
+                </wp:inline>
+              </w:drawing>
+            </w:r>
+          </w:p>
+          <w:p>
+            <w:pPr>
+              <w:spacing w:before="40"/>
+              <w:jc w:val="center"/>
+            </w:pPr>
+            <w:r>
+              <w:rPr>
+                <w:i/>
+                <w:sz w:val="17"/>
+              </w:rPr>
+              <w:t>Slika 4 — Spremnik goriva 500 l, izgled odozgo sa priključcima (ilustrativno)</w:t>
+            </w:r>
+          </w:p>
+        </w:tc>
+      </w:tr>
+    </w:tbl>
+    <w:p/>
     <w:p>
       <w:pPr>
         <w:pStyle w:val="Heading2"/>

</xml_diff>

<commit_message>
Move S-02 foundation strips into the band south of the fence
The strips were drawn from 250 mm below the panel's lower edge running 1500 mm
NORTH, which put them across the fence line and into the compound - the notes
have always said the foundations sit outside the fence, in the 1950 mm strip.
They now run south from the panel edge, inside the parcel boundary, and the
PV-n labels moved clear of them.

Drawing position only; the foundation design is unchanged, as confirmed.
</commit_message>
<xml_diff>
--- a/bht-sjednica-final-review/TD-OUTPUT/3. Prilog I TD - Specifikacija zahtjeva.docx
+++ b/bht-sjednica-final-review/TD-OUTPUT/3. Prilog I TD - Specifikacija zahtjeva.docx
@@ -7,7 +7,7 @@
         <w:pStyle w:val="Title"/>
       </w:pPr>
       <w:r>
-        <w:t>PRILOG I TENDERSKOJ DOKUMENTACIJI</w:t>
+        <w:t>PRILOG I TD</w:t>
       </w:r>
     </w:p>
     <w:p>
@@ -27,7 +27,7 @@
           <w:color w:val="595959"/>
           <w:sz w:val="20"/>
         </w:rPr>
-        <w:t>Autonomni hibridni sistem napajanja — bazna stanica SJEDNICA (Bileća)</w:t>
+        <w:t>Autonomni hibridni sistem napajanja — SJEDNICA (Bileća)</w:t>
         <w:br/>
         <w:t>LOT 1: nosači fotonaponskih panela · LOT 2: dizel električni agregat u kontejneru</w:t>
       </w:r>
@@ -43,7 +43,7 @@
           <w:i w:val="0"/>
           <w:sz w:val="19"/>
         </w:rPr>
-        <w:t>Ovaj Prilog utvrđuje tehničke zahtjeve i dokaze koje Ponuđač dostavlja UZ PONUDU. Zahtjevi označeni kao OBAVEZNI predstavljaju uslov kvalifikacije — ponuda koja ih ne sadrži smatra se neprihvatljivom. Prilog se čita zajedno sa Prilogom II (Obrazac za cijenu ponude) i Prilogom III (Situacija, dispozicija i grafički prilozi).</w:t>
+        <w:t>Ovaj Prilog utvrđuje tehničke zahtjeve i dokaze koje Ponuđač dostavlja UZ PONUDU kao uslov kvalifikacije — ponuda koja ih ne sadrži smatra se neprihvatljivom.Prilog se čita zajedno sa Prilogom II (Obrazac za cijenu ponude) i Prilogom III (Situacija, dispozicija i grafički prilozi).</w:t>
       </w:r>
     </w:p>
     <w:p>
@@ -60,7 +60,7 @@
           <w:b/>
           <w:sz w:val="19"/>
         </w:rPr>
-        <w:t>REDOSLIJED MJERODAVNOSTI. U slučaju neslaganja između dokumenata tenderske dokumentacije mjerodavni su, tim redom: (1) Tenderska dokumentacija (TD), (2) ovaj Prilog I, (3) Prilog II (Predmjer), (4) Prilog III (grafički prilozi i referentna dokumentacija). Prilog III sadrži i preuzete stranice ranije dokumentacije, koje služe samo kao podloga; mjerodavan raspored opreme i otvora u kontejneru je onaj sa crteža M-01.</w:t>
+        <w:t>U slučaju neslaganja između dokumenata TD mjerodavni su redom: (1) Tenderska dokumentacija (TD), (2) ovaj Prilog I, (3) Prilog II (Predmjer), (4) Prilog III (grafički prilozi i referentna dokumentacija). Prilog III sadrži i preuzete stranice ranije dokumentacije, koje služe samo kao podloga; mjerodavan raspored opreme i otvora u kontejneru je onaj sa crteža M-01.</w:t>
       </w:r>
     </w:p>
     <w:p>
@@ -144,7 +144,7 @@
               <w:rPr>
                 <w:sz w:val="17"/>
               </w:rPr>
-              <w:t>BS Sjednica, Bileća, Republika Srpska, BiH</w:t>
+              <w:t>Sjednica, Bileća, BiH</w:t>
             </w:r>
           </w:p>
         </w:tc>
@@ -220,7 +220,7 @@
               <w:rPr>
                 <w:sz w:val="17"/>
               </w:rPr>
-              <w:t>Priključak na EES</w:t>
+              <w:t>Priključak EES</w:t>
             </w:r>
           </w:p>
         </w:tc>
@@ -234,7 +234,7 @@
               <w:rPr>
                 <w:sz w:val="17"/>
               </w:rPr>
-              <w:t>NE — lokacija nije priključena na elektroenergetsku mrežu</w:t>
+              <w:t>NE</w:t>
             </w:r>
           </w:p>
         </w:tc>
@@ -250,7 +250,7 @@
               <w:rPr>
                 <w:sz w:val="17"/>
               </w:rPr>
-              <w:t>Potrošnja</w:t>
+              <w:t>Bilans potrošnje</w:t>
             </w:r>
           </w:p>
         </w:tc>
@@ -280,7 +280,7 @@
               <w:rPr>
                 <w:sz w:val="17"/>
               </w:rPr>
-              <w:t>Zakupljena parcela</w:t>
+              <w:t xml:space="preserve">Dostupni prostor: </w:t>
             </w:r>
           </w:p>
         </w:tc>
@@ -310,7 +310,7 @@
               <w:rPr>
                 <w:sz w:val="17"/>
               </w:rPr>
-              <w:t>Postojeći plato</w:t>
+              <w:t>Postojeći objekat</w:t>
             </w:r>
           </w:p>
         </w:tc>
@@ -384,7 +384,7 @@
               <w:rPr>
                 <w:sz w:val="17"/>
               </w:rPr>
-              <w:t>3,005 × 2,30 m vanjski, zidni paneli 60 mm, PRAZAN; ulazna vrata 900 × 2000 mm na ISTOČNOM zidu</w:t>
+              <w:t>3,00 × 2,30 m vanjski, zidni paneli 60 mm, bez opreme; ulazna vrata 900 × 2000 mm na ISTOČNOM zidu</w:t>
             </w:r>
           </w:p>
         </w:tc>
@@ -430,7 +430,7 @@
               <w:rPr>
                 <w:sz w:val="17"/>
               </w:rPr>
-              <w:t>Postojeći sistem napajanja</w:t>
+              <w:t>Sistem napajanja</w:t>
             </w:r>
           </w:p>
         </w:tc>
@@ -623,7 +623,7 @@
               <w:rPr>
                 <w:sz w:val="17"/>
               </w:rPr>
-              <w:t>prema BAS EN 1991-1-3 + BiH NA</w:t>
+              <w:t>prema BAS EN 1991-1-3 + BiH NA, Zona L1-L2</w:t>
             </w:r>
           </w:p>
         </w:tc>
@@ -1317,7 +1317,7 @@
         <w:pStyle w:val="Heading1"/>
       </w:pPr>
       <w:r>
-        <w:t>3. LOT 1 — Nosači fotonaponskih panela</w:t>
+        <w:t>3. LOT 1 — Infrastruktura fotonaponskih panela</w:t>
       </w:r>
     </w:p>
     <w:p>
@@ -1431,7 +1431,7 @@
               <w:rPr>
                 <w:sz w:val="17"/>
               </w:rPr>
-              <w:t>2 stringa × 6 modula (Voc ≈309 V, Imp 13,67 A) — po jedan string na svaku od dvije rute PVDB ormara; string se prostire preko dva nosača (v. crtež E-01)</w:t>
+              <w:t>2 stringa × 6 modula (Voc ≈309 V, Imp 13,67 A) — po jedan string na svaku od dvije rute PVDB ormara; string se prostire preko dva nosača (vidi crtež E-01)</w:t>
             </w:r>
           </w:p>
         </w:tc>
@@ -1491,7 +1491,7 @@
               <w:rPr>
                 <w:sz w:val="17"/>
               </w:rPr>
-              <w:t>Huawei iPV585-M2A (2278 × 1134 × 30 mm) ili ekvivalent</w:t>
+              <w:t>Huawei iPV585-M2A (2278 × 1134 × 30 mm)</w:t>
             </w:r>
           </w:p>
         </w:tc>
@@ -1567,7 +1567,7 @@
               <w:rPr>
                 <w:sz w:val="17"/>
               </w:rPr>
-              <w:t>Širina polja</w:t>
+              <w:t>Širina PV polja</w:t>
             </w:r>
           </w:p>
         </w:tc>
@@ -1597,7 +1597,7 @@
               <w:rPr>
                 <w:sz w:val="17"/>
               </w:rPr>
-              <w:t>Dužina polja po nagibu</w:t>
+              <w:t>Dužina PV polja po nagibu</w:t>
             </w:r>
           </w:p>
         </w:tc>
@@ -1732,36 +1732,6 @@
                 <w:sz w:val="17"/>
               </w:rPr>
               <w:t>10,55 m² po nosaču</w:t>
-            </w:r>
-          </w:p>
-        </w:tc>
-      </w:tr>
-      <w:tr>
-        <w:tc>
-          <w:tcPr>
-            <w:tcW w:type="dxa" w:w="2835"/>
-          </w:tcPr>
-          <w:p>
-            <w:r/>
-            <w:r>
-              <w:rPr>
-                <w:sz w:val="17"/>
-              </w:rPr>
-              <w:t>Referentna izvedba</w:t>
-            </w:r>
-          </w:p>
-        </w:tc>
-        <w:tc>
-          <w:tcPr>
-            <w:tcW w:type="dxa" w:w="6576"/>
-          </w:tcPr>
-          <w:p>
-            <w:r/>
-            <w:r>
-              <w:rPr>
-                <w:sz w:val="17"/>
-              </w:rPr>
-              <w:t>CUSTOM IZRADA čeličnog nosača po opterećenju iz Tačke 3.2 — nijedan kataloški proizvod (npr. Huawei Standard A-shaped Support 3.0) ne zadovoljava opterećenje vjetrom na ovoj lokaciji ni pri ovoj, manjoj površini nosača</w:t>
             </w:r>
           </w:p>
         </w:tc>
@@ -1778,7 +1748,7 @@
           <w:i/>
           <w:sz w:val="18"/>
         </w:rPr>
-        <w:t>Obrazloženje nagiba 45°: pri podnevnoj visini Sunca 23,6° na dan 21.12. i geografskoj širini 42,94°, nagib 45° ostvaruje 93 % direktnog zračenja, naspram 85 % pri 35° i 75 % pri 25°. Decembar je mjerodavni mjesec za dimenzionisanje autonomnog sistema (proizvodnja 560–600 kWh naspram potrošnje 878 kWh), zbog čega se godišnji prinos ne uzima kao kriterij.</w:t>
+        <w:t>Inklinacija 45°: pri podnevnoj visini Sunca 23,6° na dan 21.12. i geografskoj širini 42,94°, nagib 45° ostvaruje 93 % direktnog zračenja, naspram 85 % pri 35° i 75 % pri 25°. Decembar je mjerodavni mjesec za dimenzionisanje autonomnog sistema (proizvodnja 560–600 kWh naspram potrošnje 878 kWh), zbog čega se godišnji prinos ne uzima kao kriterij.</w:t>
       </w:r>
     </w:p>
     <w:p>
@@ -1786,7 +1756,7 @@
         <w:pStyle w:val="Heading2"/>
       </w:pPr>
       <w:r>
-        <w:t>3.2 Projektna opterećenja konstrukcije (OBAVEZNO)</w:t>
+        <w:t>3.2 Projektna opterećenja konstrukcije</w:t>
       </w:r>
     </w:p>
     <w:p>
@@ -1803,7 +1773,7 @@
           <w:b/>
           <w:sz w:val="19"/>
         </w:rPr>
-        <w:t>OSNOVA PRORAČUNA: kataloški nosač tipa A ima deklarisanu otpornost 31 m/s (0,52 kN/m²) pri nagibu 45° i 40 m/s (0,87 kN/m²) pri 15°/25°, što je ISPOD opterećenja ovog lokaliteta — i pri punoj (2×6) i pri ovoj, manjoj (3×4) površini nosača. Zahtijeva se CUSTOM IZRADA konstrukcije dimenzionisane i dokazane za stvarno opterećenje lokaliteta (Tačka 3.1); kataloški proizvod se ne prihvata kao osnovna ponuda.</w:t>
+        <w:t xml:space="preserve">Izrada konstrukcije : Zahtijeva se CUSTOM IZRADA konstrukcije dimenzionisaa i dokazana za stvarno opterećenje lokaliteta (Tačka 3.1); </w:t>
       </w:r>
     </w:p>
     <w:tbl>
@@ -2071,7 +2041,7 @@
         <w:pStyle w:val="Heading2"/>
       </w:pPr>
       <w:r>
-        <w:t>3.3 Materijal i izrada (OBAVEZNO)</w:t>
+        <w:t>3.3 Materijal i izrada</w:t>
       </w:r>
     </w:p>
     <w:tbl>
@@ -2399,7 +2369,7 @@
         <w:pStyle w:val="Heading2"/>
       </w:pPr>
       <w:r>
-        <w:t>3.4 Sidrenje (OBAVEZNO)</w:t>
+        <w:t>3.4 Sidrenje</w:t>
       </w:r>
     </w:p>
     <w:tbl>
@@ -2697,7 +2667,7 @@
         <w:pStyle w:val="Heading2"/>
       </w:pPr>
       <w:r>
-        <w:t>3.5 Temelji (OBAVEZNO)</w:t>
+        <w:t>3.5 Temelji</w:t>
       </w:r>
     </w:p>
     <w:tbl>
@@ -2930,19 +2900,6 @@
       </w:tr>
     </w:tbl>
     <w:p/>
-    <w:p>
-      <w:pPr>
-        <w:spacing w:after="80"/>
-      </w:pPr>
-      <w:r>
-        <w:rPr>
-          <w:b w:val="0"/>
-          <w:i/>
-          <w:sz w:val="18"/>
-        </w:rPr>
-        <w:t>NAPOMENA: postojeća AB ploča 5,40 × 5,40 m već postoji i NIJE predmet ovog LOT-a.</w:t>
-      </w:r>
-    </w:p>
     <w:p>
       <w:pPr>
         <w:pStyle w:val="Heading2"/>
@@ -3100,7 +3057,7 @@
               <w:rPr>
                 <w:sz w:val="17"/>
               </w:rPr>
-              <w:t>22 kVA / 17,6 kW standby (20 kVA / 16 kW prime), 400/230 V, 50 Hz</w:t>
+              <w:t>22 kVA / 17,6 kW standby, 400/230 V, 50 Hz</w:t>
             </w:r>
           </w:p>
         </w:tc>
@@ -3130,7 +3087,7 @@
               <w:rPr>
                 <w:sz w:val="17"/>
               </w:rPr>
-              <w:t>FG Wilson P22-6 (Skid) ili ekvivalent</w:t>
+              <w:t>FG Wilson P22-6 ili ekvivalent</w:t>
             </w:r>
           </w:p>
         </w:tc>
@@ -3190,7 +3147,7 @@
               <w:rPr>
                 <w:sz w:val="17"/>
               </w:rPr>
-              <w:t>skid, za ugradnju u postojeći kontejner</w:t>
+              <w:t>za montažu u prostor</w:t>
             </w:r>
           </w:p>
         </w:tc>
@@ -3206,7 +3163,7 @@
               <w:rPr>
                 <w:sz w:val="17"/>
               </w:rPr>
-              <w:t>Dimenzije skida</w:t>
+              <w:t>Dimenzije</w:t>
             </w:r>
           </w:p>
         </w:tc>
@@ -3220,7 +3177,7 @@
               <w:rPr>
                 <w:sz w:val="17"/>
               </w:rPr>
-              <w:t>1550 × 620 × 1020 mm (referentno)</w:t>
+              <w:t>1550 × 620 × 1020 mm (referentno +/-5%)</w:t>
             </w:r>
           </w:p>
         </w:tc>
@@ -3266,7 +3223,7 @@
               <w:rPr>
                 <w:sz w:val="17"/>
               </w:rPr>
-              <w:t>Derating</w:t>
+              <w:t>Derating na 1076 mnv i temperaturu okoline do +40 °C (ISO 3046-1)</w:t>
             </w:r>
           </w:p>
         </w:tc>
@@ -3274,15 +3231,7 @@
           <w:tcPr>
             <w:tcW w:type="dxa" w:w="6803"/>
           </w:tcPr>
-          <w:p>
-            <w:r/>
-            <w:r>
-              <w:rPr>
-                <w:sz w:val="17"/>
-              </w:rPr>
-              <w:t>dokazati za 1076 m n.v. i temperaturu do +40 °C prema ISO 3046-1</w:t>
-            </w:r>
-          </w:p>
+          <w:p/>
         </w:tc>
       </w:tr>
       <w:tr>
@@ -3296,7 +3245,7 @@
               <w:rPr>
                 <w:sz w:val="17"/>
               </w:rPr>
-              <w:t>Pobuda (OBAVEZNO)</w:t>
+              <w:t>Uzbuda (OBAVEZNO)</w:t>
             </w:r>
           </w:p>
         </w:tc>
@@ -3340,37 +3289,7 @@
               <w:rPr>
                 <w:sz w:val="17"/>
               </w:rPr>
-              <w:t>sopstvena frekvencija ≤8 Hz; fleksibilni priključci</w:t>
-            </w:r>
-          </w:p>
-        </w:tc>
-      </w:tr>
-      <w:tr>
-        <w:tc>
-          <w:tcPr>
-            <w:tcW w:type="dxa" w:w="2608"/>
-          </w:tcPr>
-          <w:p>
-            <w:r/>
-            <w:r>
-              <w:rPr>
-                <w:sz w:val="17"/>
-              </w:rPr>
-              <w:t>Potrošnja goriva</w:t>
-            </w:r>
-          </w:p>
-        </w:tc>
-        <w:tc>
-          <w:tcPr>
-            <w:tcW w:type="dxa" w:w="6803"/>
-          </w:tcPr>
-          <w:p>
-            <w:r/>
-            <w:r>
-              <w:rPr>
-                <w:sz w:val="17"/>
-              </w:rPr>
-              <w:t>5,9 l/h pri 100 % standby → autonomija ≈85 h na 500 l</w:t>
+              <w:t>vlastita frekvencija ≤8 Hz; sa fleksibilnim priključcima</w:t>
             </w:r>
           </w:p>
         </w:tc>
@@ -3441,7 +3360,7 @@
                 <w:i/>
                 <w:sz w:val="17"/>
               </w:rPr>
-              <w:t>Slika 1 — Dizel električni agregat 22 kVA u skid izvedbi, bočni izgled (ilustrativno)</w:t>
+              <w:t xml:space="preserve"> FG Wilson P22-6, bočni pogled</w:t>
             </w:r>
           </w:p>
         </w:tc>
@@ -3498,7 +3417,7 @@
                 <w:i/>
                 <w:sz w:val="17"/>
               </w:rPr>
-              <w:t>Slika 2 — Agregat, čeoni izgled sa strane hladnjaka (ilustrativno)</w:t>
+              <w:t>Slika 2 — FG Wilson P22-6, čeoni pogled (generator)</w:t>
             </w:r>
           </w:p>
         </w:tc>
@@ -3522,7 +3441,7 @@
         <w:rPr>
           <w:sz w:val="19"/>
         </w:rPr>
-        <w:t>dvoplašni, zapremine 500 l, sa sondom za detekciju curenja</w:t>
+        <w:t>metalni, dvoplašni, zapremine 500 l, sa nivo sondom i detekcijom curenja</w:t>
       </w:r>
     </w:p>
     <w:p>
@@ -3534,7 +3453,7 @@
         <w:rPr>
           <w:sz w:val="19"/>
         </w:rPr>
-        <w:t>referentne dimenzije 1050 × 600 × 1310 mm, masa prazan 170 kg — pun ≈590 kg na 0,63 m² = 9,2 kN/m²; unutar projektnih 10,00 kN/m², ali koncentrisano na mali broj sekundarnih nosača, pa je OBAVEZAN čelični ram/roštilj za raznošenje opterećenja i pod tankvanom (v. Tačku 4.8)</w:t>
+        <w:t>referentne dimenzije 1050 × 600 × 1310 mm, masa cca 170 kg — pun ≈590 kg na 0,63 m² = 9,2 kN/m²; unutar projektnih 10,00 kN/m², OBAVEZAN čelični ram/roštilj za raznošenje opterećenja i pod spremnikom (vidi Tačku 4.8)</w:t>
       </w:r>
     </w:p>
     <w:p>
@@ -3661,7 +3580,7 @@
                 <w:i/>
                 <w:sz w:val="17"/>
               </w:rPr>
-              <w:t>Slika 3 — Spremnik goriva 500 l, bočni izgled sa pretakačkom opremom (ilustrativno)</w:t>
+              <w:t>Slika 3 — Spremnik goriva 500 l, bočni izgled (ilustrativno)</w:t>
             </w:r>
           </w:p>
         </w:tc>
@@ -3718,7 +3637,7 @@
                 <w:i/>
                 <w:sz w:val="17"/>
               </w:rPr>
-              <w:t>Slika 4 — Spremnik goriva 500 l, izgled odozgo sa priključcima (ilustrativno)</w:t>
+              <w:t>Slika 4 — Spremnik goriva 500 l, pogled od vrha (ilustrativno)</w:t>
             </w:r>
           </w:p>
         </w:tc>
@@ -3939,7 +3858,7 @@
               <w:rPr>
                 <w:sz w:val="17"/>
               </w:rPr>
-              <w:t>500 × 700 mm (v ≈ 3,4 m/s, Δp ≈ 16 Pa) — zadovoljava</w:t>
+              <w:t>500 × 700 mm (v ≈ 3,4 m/s, Δp ≈ 16 Pa)</w:t>
             </w:r>
           </w:p>
         </w:tc>
@@ -3999,7 +3918,7 @@
               <w:rPr>
                 <w:sz w:val="17"/>
               </w:rPr>
-              <w:t>600 × 600 mm (Δp ≈ 15 Pa) — zadovoljava</w:t>
+              <w:t>600 × 600 mm (Δp ≈ 15 Pa)</w:t>
             </w:r>
           </w:p>
         </w:tc>
@@ -4029,7 +3948,7 @@
               <w:rPr>
                 <w:sz w:val="17"/>
               </w:rPr>
-              <w:t>1200 m³/h, Ø315, termostat, blokiran sa radom agregata</w:t>
+              <w:t>1200 m³/h, Ø315, vođen termostatom i kontrolerom DEA, blokiran sa radom DEA</w:t>
             </w:r>
           </w:p>
         </w:tc>
@@ -4059,7 +3978,7 @@
               <w:rPr>
                 <w:sz w:val="17"/>
               </w:rPr>
-              <w:t>Ponuđač dostavlja proračun pada pritiska ukupne putanje</w:t>
+              <w:t>Izvođač dostavlja proračun pada pritiska ukupne putanje</w:t>
             </w:r>
           </w:p>
         </w:tc>
@@ -4076,7 +3995,7 @@
           <w:i w:val="0"/>
           <w:sz w:val="19"/>
         </w:rPr>
-        <w:t>Raspored otvora (OBAVEZNO — prema crtežu M-01, Prilog III)</w:t>
+        <w:t>Raspored otvora (prema crtežu M-01, Prilog III)</w:t>
       </w:r>
     </w:p>
     <w:tbl>
@@ -4152,7 +4071,7 @@
               <w:rPr>
                 <w:sz w:val="17"/>
               </w:rPr>
-              <w:t>JUŽNI zid, istočni kraj; donja ivica +0,30 m od poda</w:t>
+              <w:t>JUŽNI zid, desno; donja ivica +0,30 m od poda</w:t>
             </w:r>
           </w:p>
         </w:tc>
@@ -4182,7 +4101,7 @@
               <w:rPr>
                 <w:sz w:val="17"/>
               </w:rPr>
-              <w:t>ZAPADNI zid, na osi radijatora agregata; kanal najkraćim putem od radijatora kroz zid</w:t>
+              <w:t>ZAPADNI zid, na osi hladnjaka agregata; kanal najkraćim putem od hladnjaka agregata kroz kontejner</w:t>
             </w:r>
           </w:p>
         </w:tc>
@@ -4198,7 +4117,7 @@
               <w:rPr>
                 <w:sz w:val="17"/>
               </w:rPr>
-              <w:t>Izduvni sistem</w:t>
+              <w:t>Izduv</w:t>
             </w:r>
           </w:p>
         </w:tc>
@@ -4242,7 +4161,7 @@
               <w:rPr>
                 <w:sz w:val="17"/>
               </w:rPr>
-              <w:t>SJEVERNI zid, istočni kraj</w:t>
+              <w:t>SJEVERNI zid, prema istoku</w:t>
             </w:r>
           </w:p>
         </w:tc>
@@ -4372,7 +4291,7 @@
                 <w:i/>
                 <w:sz w:val="17"/>
               </w:rPr>
-              <w:t>Slika 5 — Raspored opreme i otvora u kontejneru: ukrsni tok zraka (usis JUG → agregat → izlaz ZAPAD). Izvod iz crteža M-01, Prilog III</w:t>
+              <w:t>Slika 5 — Raspored opreme i otvora u kontejneru: (usis JUG → agregat → izlaz ZAPAD). Crteža M-01, Prilog III</w:t>
             </w:r>
           </w:p>
         </w:tc>
@@ -4393,7 +4312,7 @@
           <w:b/>
           <w:sz w:val="19"/>
         </w:rPr>
-        <w:t>Otvori se izvode kroz ZIDNE PANELE kontejnera, a NE kroz ulazna vrata. Raspored je ukrsni (usis JUG → agregat → izlaz ZAPAD) i obavezujući: nije dozvoljeno izvesti usis, izlaz i izduv na istom zidu, niti usmjeriti izlaz toplog zraka ili izduv prema SJEVERNOJ strani, gdje se nalaze postojeći vanjski ormari ICC330-H1 i MTS9302. Svaki drugačiji raspored Ponuđač mora dokazati proračunom recirkulacije i temperaturnog uticaja i dobiti pisanu saglasnost Kupca.</w:t>
+        <w:t>Otvori se izvode kroz ZIDNE PANELE kontejnera,Raspored je ukrsni (usis JUG → agregat → izlaz ZAPAD) i obavezujući: nije dozvoljeno izvesti usis, izlaz i izduv na istom zidu, niti usmjeriti izlaz toplog zraka ili izduv prema SJEVERNOJ strani, gdje se nalaze postojeći vanjski ormari ICC330-H1 i MTS9302. Dozvoljava se promjena rasporeda otvora, uz proračun recirkulacije i temperaturnog uticaja i saglasnost NO Kupca.</w:t>
       </w:r>
     </w:p>
     <w:p>
@@ -4729,7 +4648,7 @@
         <w:pStyle w:val="Heading2"/>
       </w:pPr>
       <w:r>
-        <w:t>4.5 Elektroinstalacije i zaštita (OBAVEZNO)</w:t>
+        <w:t>4.5 Elektroinstalacije i zaštite</w:t>
       </w:r>
     </w:p>
     <w:p>
@@ -4746,7 +4665,7 @@
           <w:b/>
           <w:sz w:val="19"/>
         </w:rPr>
-        <w:t>KRITIČNO — POBUDA GENERATORA. Referentni agregat je u standardnoj izvedbi SHUNT pobude, za koju tehnički list proizvođača deklariše trajnu struju kratkog spoja 0 % (nezavisna pobuda PMG / AUX je opcija). Kod SHUNT pobude napon na stezaljkama se pri kvaru uruši, pobuda nestaje, a trajna struja kvara padne na ≈0,5 × In — ISPOD nazivne struje, pa ne može aktivirati nijednu prekostrujnu zaštitu. Zbog toga se zahtijeva NEZAVISNA POBUDA (PMG ili AREP/AUX) sa 3 × In u trajanju ≥10 s (Tačka 4.1), a zaštita zaštitnom strujnom sklopkom ostaje OBAVEZNA kao drugi nivo zaštite.</w:t>
+        <w:t>Zahtijeva se NEZAVISNA POBUDA generatora (PMG ili AREP/AUX) sa 3 × In u trajanju ≥10 s (Tačka 4.1), kao i zaštita ZS sklopkom kao drugi nivo zaštite.</w:t>
       </w:r>
     </w:p>
     <w:tbl>
@@ -5122,7 +5041,7 @@
               <w:rPr>
                 <w:sz w:val="17"/>
               </w:rPr>
-              <w:t>snimiti stanje i prevezati svih 7 postojećih krugova u novi GRO; signalna rasvjeta prepreke antenskog stuba (K7) na zasebnom nadziranom krugu, sa signalizacijom ispada u sistem daljinskog nadzora</w:t>
+              <w:t>snimiti stanje i prevezati svih 7 postojećih krugova u novi GRO; signalna rasvjeta antenskog stuba (K7) na zasebnom nadziranom krugu, sa signalizacijom ispada u sistem daljinskog nadzora</w:t>
             </w:r>
           </w:p>
         </w:tc>
@@ -5224,7 +5143,7 @@
         <w:pStyle w:val="Heading2"/>
       </w:pPr>
       <w:r>
-        <w:t>4.6 Upravljanje i nadzor</w:t>
+        <w:t>4.6 Parametriranje upravljanja i nadzora radom DEA &lt;--&gt; PV + Baterija</w:t>
       </w:r>
     </w:p>
     <w:p>
@@ -5385,7 +5304,7 @@
         <w:pStyle w:val="Heading1"/>
       </w:pPr>
       <w:r>
-        <w:t>5. Dokazi koji se dostavljaju UZ PONUDU (uslov kvalifikacije)</w:t>
+        <w:t>5. Dokazi koji se dostavljaju uz ponudu: oznaka PONUDA</w:t>
       </w:r>
     </w:p>
     <w:p>
@@ -5402,7 +5321,7 @@
           <w:b/>
           <w:sz w:val="19"/>
         </w:rPr>
-        <w:t>Ponuda koja ne sadrži dokaze označene kao OBAVEZNI smatra se neprihvatljivom. Dokazi se NE dostavljaju naknadno, nakon dodjele ugovora.</w:t>
+        <w:t>Dokazi koji se dostavljaju NO u toku realizacije: oznaka REALIZACIJA. Dokazi koji se dostavljaju NO tokom primopredaje: oznaka PRIMOPREDAJA.</w:t>
       </w:r>
     </w:p>
     <w:tbl>
@@ -5424,7 +5343,7 @@
         </w:trPr>
         <w:tc>
           <w:tcPr>
-            <w:tcW w:type="dxa" w:w="680"/>
+            <w:tcW w:type="dxa" w:w="567"/>
             <w:shd w:fill="F2F2F2"/>
           </w:tcPr>
           <w:p>
@@ -5440,7 +5359,7 @@
         </w:tc>
         <w:tc>
           <w:tcPr>
-            <w:tcW w:type="dxa" w:w="5443"/>
+            <w:tcW w:type="dxa" w:w="5896"/>
             <w:shd w:fill="F2F2F2"/>
           </w:tcPr>
           <w:p>
@@ -5456,7 +5375,7 @@
         </w:tc>
         <w:tc>
           <w:tcPr>
-            <w:tcW w:type="dxa" w:w="907"/>
+            <w:tcW w:type="dxa" w:w="1020"/>
             <w:shd w:fill="F2F2F2"/>
           </w:tcPr>
           <w:p>
@@ -5472,7 +5391,7 @@
         </w:tc>
         <w:tc>
           <w:tcPr>
-            <w:tcW w:type="dxa" w:w="2381"/>
+            <w:tcW w:type="dxa" w:w="1928"/>
             <w:shd w:fill="F2F2F2"/>
           </w:tcPr>
           <w:p>
@@ -5490,7 +5409,7 @@
       <w:tr>
         <w:tc>
           <w:tcPr>
-            <w:tcW w:type="dxa" w:w="680"/>
+            <w:tcW w:type="dxa" w:w="567"/>
           </w:tcPr>
           <w:p>
             <w:r/>
@@ -5504,7 +5423,7 @@
         </w:tc>
         <w:tc>
           <w:tcPr>
-            <w:tcW w:type="dxa" w:w="5443"/>
+            <w:tcW w:type="dxa" w:w="5896"/>
           </w:tcPr>
           <w:p>
             <w:r/>
@@ -5518,7 +5437,7 @@
         </w:tc>
         <w:tc>
           <w:tcPr>
-            <w:tcW w:type="dxa" w:w="907"/>
+            <w:tcW w:type="dxa" w:w="1020"/>
           </w:tcPr>
           <w:p>
             <w:r/>
@@ -5532,15 +5451,15 @@
         </w:tc>
         <w:tc>
           <w:tcPr>
-            <w:tcW w:type="dxa" w:w="2381"/>
-          </w:tcPr>
-          <w:p>
-            <w:r/>
-            <w:r>
-              <w:rPr>
-                <w:sz w:val="17"/>
-              </w:rPr>
-              <w:t>OBAVEZNO</w:t>
+            <w:tcW w:type="dxa" w:w="1928"/>
+          </w:tcPr>
+          <w:p>
+            <w:r/>
+            <w:r>
+              <w:rPr>
+                <w:sz w:val="17"/>
+              </w:rPr>
+              <w:t>REALIZACIJA</w:t>
             </w:r>
           </w:p>
         </w:tc>
@@ -5548,7 +5467,7 @@
       <w:tr>
         <w:tc>
           <w:tcPr>
-            <w:tcW w:type="dxa" w:w="680"/>
+            <w:tcW w:type="dxa" w:w="567"/>
           </w:tcPr>
           <w:p>
             <w:r/>
@@ -5562,21 +5481,21 @@
         </w:tc>
         <w:tc>
           <w:tcPr>
-            <w:tcW w:type="dxa" w:w="5443"/>
-          </w:tcPr>
-          <w:p>
-            <w:r/>
-            <w:r>
-              <w:rPr>
-                <w:sz w:val="17"/>
-              </w:rPr>
-              <w:t>Radionički crteži konstrukcije i temelja</w:t>
-            </w:r>
-          </w:p>
-        </w:tc>
-        <w:tc>
-          <w:tcPr>
-            <w:tcW w:type="dxa" w:w="907"/>
+            <w:tcW w:type="dxa" w:w="5896"/>
+          </w:tcPr>
+          <w:p>
+            <w:r/>
+            <w:r>
+              <w:rPr>
+                <w:sz w:val="17"/>
+              </w:rPr>
+              <w:t>Tečnički nacrti konstrukcije i temelja</w:t>
+            </w:r>
+          </w:p>
+        </w:tc>
+        <w:tc>
+          <w:tcPr>
+            <w:tcW w:type="dxa" w:w="1020"/>
           </w:tcPr>
           <w:p>
             <w:r/>
@@ -5590,15 +5509,15 @@
         </w:tc>
         <w:tc>
           <w:tcPr>
-            <w:tcW w:type="dxa" w:w="2381"/>
-          </w:tcPr>
-          <w:p>
-            <w:r/>
-            <w:r>
-              <w:rPr>
-                <w:sz w:val="17"/>
-              </w:rPr>
-              <w:t>OBAVEZNO</w:t>
+            <w:tcW w:type="dxa" w:w="1928"/>
+          </w:tcPr>
+          <w:p>
+            <w:r/>
+            <w:r>
+              <w:rPr>
+                <w:sz w:val="17"/>
+              </w:rPr>
+              <w:t>PONUDA</w:t>
             </w:r>
           </w:p>
         </w:tc>
@@ -5606,7 +5525,7 @@
       <w:tr>
         <w:tc>
           <w:tcPr>
-            <w:tcW w:type="dxa" w:w="680"/>
+            <w:tcW w:type="dxa" w:w="567"/>
           </w:tcPr>
           <w:p>
             <w:r/>
@@ -5620,7 +5539,7 @@
         </w:tc>
         <w:tc>
           <w:tcPr>
-            <w:tcW w:type="dxa" w:w="5443"/>
+            <w:tcW w:type="dxa" w:w="5896"/>
           </w:tcPr>
           <w:p>
             <w:r/>
@@ -5634,7 +5553,7 @@
         </w:tc>
         <w:tc>
           <w:tcPr>
-            <w:tcW w:type="dxa" w:w="907"/>
+            <w:tcW w:type="dxa" w:w="1020"/>
           </w:tcPr>
           <w:p>
             <w:r/>
@@ -5648,15 +5567,15 @@
         </w:tc>
         <w:tc>
           <w:tcPr>
-            <w:tcW w:type="dxa" w:w="2381"/>
-          </w:tcPr>
-          <w:p>
-            <w:r/>
-            <w:r>
-              <w:rPr>
-                <w:sz w:val="17"/>
-              </w:rPr>
-              <w:t>OBAVEZNO</w:t>
+            <w:tcW w:type="dxa" w:w="1928"/>
+          </w:tcPr>
+          <w:p>
+            <w:r/>
+            <w:r>
+              <w:rPr>
+                <w:sz w:val="17"/>
+              </w:rPr>
+              <w:t>REALIZACIJA</w:t>
             </w:r>
           </w:p>
         </w:tc>
@@ -5664,7 +5583,7 @@
       <w:tr>
         <w:tc>
           <w:tcPr>
-            <w:tcW w:type="dxa" w:w="680"/>
+            <w:tcW w:type="dxa" w:w="567"/>
           </w:tcPr>
           <w:p>
             <w:r/>
@@ -5678,7 +5597,7 @@
         </w:tc>
         <w:tc>
           <w:tcPr>
-            <w:tcW w:type="dxa" w:w="5443"/>
+            <w:tcW w:type="dxa" w:w="5896"/>
           </w:tcPr>
           <w:p>
             <w:r/>
@@ -5692,7 +5611,7 @@
         </w:tc>
         <w:tc>
           <w:tcPr>
-            <w:tcW w:type="dxa" w:w="907"/>
+            <w:tcW w:type="dxa" w:w="1020"/>
           </w:tcPr>
           <w:p>
             <w:r/>
@@ -5706,15 +5625,15 @@
         </w:tc>
         <w:tc>
           <w:tcPr>
-            <w:tcW w:type="dxa" w:w="2381"/>
-          </w:tcPr>
-          <w:p>
-            <w:r/>
-            <w:r>
-              <w:rPr>
-                <w:sz w:val="17"/>
-              </w:rPr>
-              <w:t>OBAVEZNO</w:t>
+            <w:tcW w:type="dxa" w:w="1928"/>
+          </w:tcPr>
+          <w:p>
+            <w:r/>
+            <w:r>
+              <w:rPr>
+                <w:sz w:val="17"/>
+              </w:rPr>
+              <w:t>REALIZACIJA</w:t>
             </w:r>
           </w:p>
         </w:tc>
@@ -5722,7 +5641,7 @@
       <w:tr>
         <w:tc>
           <w:tcPr>
-            <w:tcW w:type="dxa" w:w="680"/>
+            <w:tcW w:type="dxa" w:w="567"/>
           </w:tcPr>
           <w:p>
             <w:r/>
@@ -5736,21 +5655,21 @@
         </w:tc>
         <w:tc>
           <w:tcPr>
-            <w:tcW w:type="dxa" w:w="5443"/>
-          </w:tcPr>
-          <w:p>
-            <w:r/>
-            <w:r>
-              <w:rPr>
-                <w:sz w:val="17"/>
-              </w:rPr>
-              <w:t>ETA odobrenje ponuđenih hemijskih ankera sa proračunom nosivosti</w:t>
-            </w:r>
-          </w:p>
-        </w:tc>
-        <w:tc>
-          <w:tcPr>
-            <w:tcW w:type="dxa" w:w="907"/>
+            <w:tcW w:type="dxa" w:w="5896"/>
+          </w:tcPr>
+          <w:p>
+            <w:r/>
+            <w:r>
+              <w:rPr>
+                <w:sz w:val="17"/>
+              </w:rPr>
+              <w:t>ETA certifikat i proračun za hemijska sidra</w:t>
+            </w:r>
+          </w:p>
+        </w:tc>
+        <w:tc>
+          <w:tcPr>
+            <w:tcW w:type="dxa" w:w="1020"/>
           </w:tcPr>
           <w:p>
             <w:r/>
@@ -5764,15 +5683,15 @@
         </w:tc>
         <w:tc>
           <w:tcPr>
-            <w:tcW w:type="dxa" w:w="2381"/>
-          </w:tcPr>
-          <w:p>
-            <w:r/>
-            <w:r>
-              <w:rPr>
-                <w:sz w:val="17"/>
-              </w:rPr>
-              <w:t>OBAVEZNO</w:t>
+            <w:tcW w:type="dxa" w:w="1928"/>
+          </w:tcPr>
+          <w:p>
+            <w:r/>
+            <w:r>
+              <w:rPr>
+                <w:sz w:val="17"/>
+              </w:rPr>
+              <w:t>REALIZACIJA</w:t>
             </w:r>
           </w:p>
         </w:tc>
@@ -5780,7 +5699,7 @@
       <w:tr>
         <w:tc>
           <w:tcPr>
-            <w:tcW w:type="dxa" w:w="680"/>
+            <w:tcW w:type="dxa" w:w="567"/>
           </w:tcPr>
           <w:p>
             <w:r/>
@@ -5794,43 +5713,43 @@
         </w:tc>
         <w:tc>
           <w:tcPr>
-            <w:tcW w:type="dxa" w:w="5443"/>
-          </w:tcPr>
-          <w:p>
-            <w:r/>
-            <w:r>
-              <w:rPr>
-                <w:sz w:val="17"/>
-              </w:rPr>
-              <w:t>Tehnički list (TDS) ponuđenog agregata sa podacima o hlađenju, izduvu i masama</w:t>
-            </w:r>
-          </w:p>
-        </w:tc>
-        <w:tc>
-          <w:tcPr>
-            <w:tcW w:type="dxa" w:w="907"/>
-          </w:tcPr>
-          <w:p>
-            <w:r/>
-            <w:r>
-              <w:rPr>
-                <w:sz w:val="17"/>
-              </w:rPr>
-              <w:t>2</w:t>
-            </w:r>
-          </w:p>
-        </w:tc>
-        <w:tc>
-          <w:tcPr>
-            <w:tcW w:type="dxa" w:w="2381"/>
-          </w:tcPr>
-          <w:p>
-            <w:r/>
-            <w:r>
-              <w:rPr>
-                <w:sz w:val="17"/>
-              </w:rPr>
-              <w:t>OBAVEZNO</w:t>
+            <w:tcW w:type="dxa" w:w="5896"/>
+          </w:tcPr>
+          <w:p>
+            <w:r/>
+            <w:r>
+              <w:rPr>
+                <w:sz w:val="17"/>
+              </w:rPr>
+              <w:t>Zapisnik o ispitivanju ankera na čupanje (min. 10 %)</w:t>
+            </w:r>
+          </w:p>
+        </w:tc>
+        <w:tc>
+          <w:tcPr>
+            <w:tcW w:type="dxa" w:w="1020"/>
+          </w:tcPr>
+          <w:p>
+            <w:r/>
+            <w:r>
+              <w:rPr>
+                <w:sz w:val="17"/>
+              </w:rPr>
+              <w:t>1</w:t>
+            </w:r>
+          </w:p>
+        </w:tc>
+        <w:tc>
+          <w:tcPr>
+            <w:tcW w:type="dxa" w:w="1928"/>
+          </w:tcPr>
+          <w:p>
+            <w:r/>
+            <w:r>
+              <w:rPr>
+                <w:sz w:val="17"/>
+              </w:rPr>
+              <w:t>PRIMOPREDAJA</w:t>
             </w:r>
           </w:p>
         </w:tc>
@@ -5838,7 +5757,7 @@
       <w:tr>
         <w:tc>
           <w:tcPr>
-            <w:tcW w:type="dxa" w:w="680"/>
+            <w:tcW w:type="dxa" w:w="567"/>
           </w:tcPr>
           <w:p>
             <w:r/>
@@ -5852,21 +5771,21 @@
         </w:tc>
         <w:tc>
           <w:tcPr>
-            <w:tcW w:type="dxa" w:w="5443"/>
-          </w:tcPr>
-          <w:p>
-            <w:r/>
-            <w:r>
-              <w:rPr>
-                <w:sz w:val="17"/>
-              </w:rPr>
-              <w:t>Proračun ventilacije sa padom pritiska ukupne putanje (≤125 Pa)</w:t>
-            </w:r>
-          </w:p>
-        </w:tc>
-        <w:tc>
-          <w:tcPr>
-            <w:tcW w:type="dxa" w:w="907"/>
+            <w:tcW w:type="dxa" w:w="5896"/>
+          </w:tcPr>
+          <w:p>
+            <w:r/>
+            <w:r>
+              <w:rPr>
+                <w:sz w:val="17"/>
+              </w:rPr>
+              <w:t>Tehnički list (TDS) agregata sa dokazom o PMG/AREP nezavisnoj pobudi (3 × In, ≥10 s)</w:t>
+            </w:r>
+          </w:p>
+        </w:tc>
+        <w:tc>
+          <w:tcPr>
+            <w:tcW w:type="dxa" w:w="1020"/>
           </w:tcPr>
           <w:p>
             <w:r/>
@@ -5880,15 +5799,15 @@
         </w:tc>
         <w:tc>
           <w:tcPr>
-            <w:tcW w:type="dxa" w:w="2381"/>
-          </w:tcPr>
-          <w:p>
-            <w:r/>
-            <w:r>
-              <w:rPr>
-                <w:sz w:val="17"/>
-              </w:rPr>
-              <w:t>OBAVEZNO</w:t>
+            <w:tcW w:type="dxa" w:w="1928"/>
+          </w:tcPr>
+          <w:p>
+            <w:r/>
+            <w:r>
+              <w:rPr>
+                <w:sz w:val="17"/>
+              </w:rPr>
+              <w:t>PONUDA</w:t>
             </w:r>
           </w:p>
         </w:tc>
@@ -5896,7 +5815,7 @@
       <w:tr>
         <w:tc>
           <w:tcPr>
-            <w:tcW w:type="dxa" w:w="680"/>
+            <w:tcW w:type="dxa" w:w="567"/>
           </w:tcPr>
           <w:p>
             <w:r/>
@@ -5910,21 +5829,21 @@
         </w:tc>
         <w:tc>
           <w:tcPr>
-            <w:tcW w:type="dxa" w:w="5443"/>
-          </w:tcPr>
-          <w:p>
-            <w:r/>
-            <w:r>
-              <w:rPr>
-                <w:sz w:val="17"/>
-              </w:rPr>
-              <w:t>Proračun protutlaka izduvnog sistema</w:t>
-            </w:r>
-          </w:p>
-        </w:tc>
-        <w:tc>
-          <w:tcPr>
-            <w:tcW w:type="dxa" w:w="907"/>
+            <w:tcW w:type="dxa" w:w="5896"/>
+          </w:tcPr>
+          <w:p>
+            <w:r/>
+            <w:r>
+              <w:rPr>
+                <w:sz w:val="17"/>
+              </w:rPr>
+              <w:t>Proračun pada pritiska ventilacije i protutlaka izduvnog sistema</w:t>
+            </w:r>
+          </w:p>
+        </w:tc>
+        <w:tc>
+          <w:tcPr>
+            <w:tcW w:type="dxa" w:w="1020"/>
           </w:tcPr>
           <w:p>
             <w:r/>
@@ -5938,15 +5857,15 @@
         </w:tc>
         <w:tc>
           <w:tcPr>
-            <w:tcW w:type="dxa" w:w="2381"/>
-          </w:tcPr>
-          <w:p>
-            <w:r/>
-            <w:r>
-              <w:rPr>
-                <w:sz w:val="17"/>
-              </w:rPr>
-              <w:t>OBAVEZNO</w:t>
+            <w:tcW w:type="dxa" w:w="1928"/>
+          </w:tcPr>
+          <w:p>
+            <w:r/>
+            <w:r>
+              <w:rPr>
+                <w:sz w:val="17"/>
+              </w:rPr>
+              <w:t>REALIZACIJA</w:t>
             </w:r>
           </w:p>
         </w:tc>
@@ -5954,7 +5873,7 @@
       <w:tr>
         <w:tc>
           <w:tcPr>
-            <w:tcW w:type="dxa" w:w="680"/>
+            <w:tcW w:type="dxa" w:w="567"/>
           </w:tcPr>
           <w:p>
             <w:r/>
@@ -5968,21 +5887,21 @@
         </w:tc>
         <w:tc>
           <w:tcPr>
-            <w:tcW w:type="dxa" w:w="5443"/>
-          </w:tcPr>
-          <w:p>
-            <w:r/>
-            <w:r>
-              <w:rPr>
-                <w:sz w:val="17"/>
-              </w:rPr>
-              <w:t>Proračun nosivosti poda kontejnera za skid i pun spremnik</w:t>
-            </w:r>
-          </w:p>
-        </w:tc>
-        <w:tc>
-          <w:tcPr>
-            <w:tcW w:type="dxa" w:w="907"/>
+            <w:tcW w:type="dxa" w:w="5896"/>
+          </w:tcPr>
+          <w:p>
+            <w:r/>
+            <w:r>
+              <w:rPr>
+                <w:sz w:val="17"/>
+              </w:rPr>
+              <w:t>Elaborat zaštite od požara za prostor sa rezervoarom 500 l</w:t>
+            </w:r>
+          </w:p>
+        </w:tc>
+        <w:tc>
+          <w:tcPr>
+            <w:tcW w:type="dxa" w:w="1020"/>
           </w:tcPr>
           <w:p>
             <w:r/>
@@ -5996,15 +5915,15 @@
         </w:tc>
         <w:tc>
           <w:tcPr>
-            <w:tcW w:type="dxa" w:w="2381"/>
-          </w:tcPr>
-          <w:p>
-            <w:r/>
-            <w:r>
-              <w:rPr>
-                <w:sz w:val="17"/>
-              </w:rPr>
-              <w:t>OBAVEZNO</w:t>
+            <w:tcW w:type="dxa" w:w="1928"/>
+          </w:tcPr>
+          <w:p>
+            <w:r/>
+            <w:r>
+              <w:rPr>
+                <w:sz w:val="17"/>
+              </w:rPr>
+              <w:t>REALIZACIJA</w:t>
             </w:r>
           </w:p>
         </w:tc>
@@ -6012,7 +5931,7 @@
       <w:tr>
         <w:tc>
           <w:tcPr>
-            <w:tcW w:type="dxa" w:w="680"/>
+            <w:tcW w:type="dxa" w:w="567"/>
           </w:tcPr>
           <w:p>
             <w:r/>
@@ -6026,21 +5945,21 @@
         </w:tc>
         <w:tc>
           <w:tcPr>
-            <w:tcW w:type="dxa" w:w="5443"/>
-          </w:tcPr>
-          <w:p>
-            <w:r/>
-            <w:r>
-              <w:rPr>
-                <w:sz w:val="17"/>
-              </w:rPr>
-              <w:t>Jednopolna shema novog GRO sa zaštitnim uređajima</w:t>
-            </w:r>
-          </w:p>
-        </w:tc>
-        <w:tc>
-          <w:tcPr>
-            <w:tcW w:type="dxa" w:w="907"/>
+            <w:tcW w:type="dxa" w:w="5896"/>
+          </w:tcPr>
+          <w:p>
+            <w:r/>
+            <w:r>
+              <w:rPr>
+                <w:sz w:val="17"/>
+              </w:rPr>
+              <w:t>Atesti i certifikati za elektro opremu, CPR kablove i prenaponsku zaštitu (SPD)</w:t>
+            </w:r>
+          </w:p>
+        </w:tc>
+        <w:tc>
+          <w:tcPr>
+            <w:tcW w:type="dxa" w:w="1020"/>
           </w:tcPr>
           <w:p>
             <w:r/>
@@ -6054,15 +5973,15 @@
         </w:tc>
         <w:tc>
           <w:tcPr>
-            <w:tcW w:type="dxa" w:w="2381"/>
-          </w:tcPr>
-          <w:p>
-            <w:r/>
-            <w:r>
-              <w:rPr>
-                <w:sz w:val="17"/>
-              </w:rPr>
-              <w:t>OBAVEZNO</w:t>
+            <w:tcW w:type="dxa" w:w="1928"/>
+          </w:tcPr>
+          <w:p>
+            <w:r/>
+            <w:r>
+              <w:rPr>
+                <w:sz w:val="17"/>
+              </w:rPr>
+              <w:t>REALIZACIJA</w:t>
             </w:r>
           </w:p>
         </w:tc>
@@ -6070,7 +5989,7 @@
       <w:tr>
         <w:tc>
           <w:tcPr>
-            <w:tcW w:type="dxa" w:w="680"/>
+            <w:tcW w:type="dxa" w:w="567"/>
           </w:tcPr>
           <w:p>
             <w:r/>
@@ -6084,21 +6003,21 @@
         </w:tc>
         <w:tc>
           <w:tcPr>
-            <w:tcW w:type="dxa" w:w="5443"/>
-          </w:tcPr>
-          <w:p>
-            <w:r/>
-            <w:r>
-              <w:rPr>
-                <w:sz w:val="17"/>
-              </w:rPr>
-              <w:t>Ovlaštenje proizvođača ili ovlaštenog distributera za ponuđeni agregat</w:t>
-            </w:r>
-          </w:p>
-        </w:tc>
-        <w:tc>
-          <w:tcPr>
-            <w:tcW w:type="dxa" w:w="907"/>
+            <w:tcW w:type="dxa" w:w="5896"/>
+          </w:tcPr>
+          <w:p>
+            <w:r/>
+            <w:r>
+              <w:rPr>
+                <w:sz w:val="17"/>
+              </w:rPr>
+              <w:t>Ispitni protokoli elektroinstalacija i otpora uzemljenja (≤10 Ω)</w:t>
+            </w:r>
+          </w:p>
+        </w:tc>
+        <w:tc>
+          <w:tcPr>
+            <w:tcW w:type="dxa" w:w="1020"/>
           </w:tcPr>
           <w:p>
             <w:r/>
@@ -6112,15 +6031,15 @@
         </w:tc>
         <w:tc>
           <w:tcPr>
-            <w:tcW w:type="dxa" w:w="2381"/>
-          </w:tcPr>
-          <w:p>
-            <w:r/>
-            <w:r>
-              <w:rPr>
-                <w:sz w:val="17"/>
-              </w:rPr>
-              <w:t>OBAVEZNO</w:t>
+            <w:tcW w:type="dxa" w:w="1928"/>
+          </w:tcPr>
+          <w:p>
+            <w:r/>
+            <w:r>
+              <w:rPr>
+                <w:sz w:val="17"/>
+              </w:rPr>
+              <w:t>PRIMOPREDAJA</w:t>
             </w:r>
           </w:p>
         </w:tc>
@@ -6128,7 +6047,7 @@
       <w:tr>
         <w:tc>
           <w:tcPr>
-            <w:tcW w:type="dxa" w:w="680"/>
+            <w:tcW w:type="dxa" w:w="567"/>
           </w:tcPr>
           <w:p>
             <w:r/>
@@ -6142,21 +6061,21 @@
         </w:tc>
         <w:tc>
           <w:tcPr>
-            <w:tcW w:type="dxa" w:w="5443"/>
-          </w:tcPr>
-          <w:p>
-            <w:r/>
-            <w:r>
-              <w:rPr>
-                <w:sz w:val="17"/>
-              </w:rPr>
-              <w:t>ISO 9001 i ISO 14001 proizvođača agregata</w:t>
-            </w:r>
-          </w:p>
-        </w:tc>
-        <w:tc>
-          <w:tcPr>
-            <w:tcW w:type="dxa" w:w="907"/>
+            <w:tcW w:type="dxa" w:w="5896"/>
+          </w:tcPr>
+          <w:p>
+            <w:r/>
+            <w:r>
+              <w:rPr>
+                <w:sz w:val="17"/>
+              </w:rPr>
+              <w:t>Protokol o parametriranju i funkcionalnom ispitivanju integracije DEA–PV–baterija</w:t>
+            </w:r>
+          </w:p>
+        </w:tc>
+        <w:tc>
+          <w:tcPr>
+            <w:tcW w:type="dxa" w:w="1020"/>
           </w:tcPr>
           <w:p>
             <w:r/>
@@ -6170,131 +6089,15 @@
         </w:tc>
         <w:tc>
           <w:tcPr>
-            <w:tcW w:type="dxa" w:w="2381"/>
-          </w:tcPr>
-          <w:p>
-            <w:r/>
-            <w:r>
-              <w:rPr>
-                <w:sz w:val="17"/>
-              </w:rPr>
-              <w:t>OBAVEZNO</w:t>
-            </w:r>
-          </w:p>
-        </w:tc>
-      </w:tr>
-      <w:tr>
-        <w:tc>
-          <w:tcPr>
-            <w:tcW w:type="dxa" w:w="680"/>
-          </w:tcPr>
-          <w:p>
-            <w:r/>
-            <w:r>
-              <w:rPr>
-                <w:sz w:val="17"/>
-              </w:rPr>
-              <w:t>13</w:t>
-            </w:r>
-          </w:p>
-        </w:tc>
-        <w:tc>
-          <w:tcPr>
-            <w:tcW w:type="dxa" w:w="5443"/>
-          </w:tcPr>
-          <w:p>
-            <w:r/>
-            <w:r>
-              <w:rPr>
-                <w:sz w:val="17"/>
-              </w:rPr>
-              <w:t>Kataloška dokumentacija sa označenim ponuđenim tipovima</w:t>
-            </w:r>
-          </w:p>
-        </w:tc>
-        <w:tc>
-          <w:tcPr>
-            <w:tcW w:type="dxa" w:w="907"/>
-          </w:tcPr>
-          <w:p>
-            <w:r/>
-            <w:r>
-              <w:rPr>
-                <w:sz w:val="17"/>
-              </w:rPr>
-              <w:t>1, 2</w:t>
-            </w:r>
-          </w:p>
-        </w:tc>
-        <w:tc>
-          <w:tcPr>
-            <w:tcW w:type="dxa" w:w="2381"/>
-          </w:tcPr>
-          <w:p>
-            <w:r/>
-            <w:r>
-              <w:rPr>
-                <w:sz w:val="17"/>
-              </w:rPr>
-              <w:t>OBAVEZNO</w:t>
-            </w:r>
-          </w:p>
-        </w:tc>
-      </w:tr>
-      <w:tr>
-        <w:tc>
-          <w:tcPr>
-            <w:tcW w:type="dxa" w:w="680"/>
-          </w:tcPr>
-          <w:p>
-            <w:r/>
-            <w:r>
-              <w:rPr>
-                <w:sz w:val="17"/>
-              </w:rPr>
-              <w:t>14</w:t>
-            </w:r>
-          </w:p>
-        </w:tc>
-        <w:tc>
-          <w:tcPr>
-            <w:tcW w:type="dxa" w:w="5443"/>
-          </w:tcPr>
-          <w:p>
-            <w:r/>
-            <w:r>
-              <w:rPr>
-                <w:sz w:val="17"/>
-              </w:rPr>
-              <w:t>Akustički proračun, ako se zahtijeva nivo buke</w:t>
-            </w:r>
-          </w:p>
-        </w:tc>
-        <w:tc>
-          <w:tcPr>
-            <w:tcW w:type="dxa" w:w="907"/>
-          </w:tcPr>
-          <w:p>
-            <w:r/>
-            <w:r>
-              <w:rPr>
-                <w:sz w:val="17"/>
-              </w:rPr>
-              <w:t>2</w:t>
-            </w:r>
-          </w:p>
-        </w:tc>
-        <w:tc>
-          <w:tcPr>
-            <w:tcW w:type="dxa" w:w="2381"/>
-          </w:tcPr>
-          <w:p>
-            <w:r/>
-            <w:r>
-              <w:rPr>
-                <w:sz w:val="17"/>
-              </w:rPr>
-              <w:t>po potrebi</w:t>
+            <w:tcW w:type="dxa" w:w="1928"/>
+          </w:tcPr>
+          <w:p>
+            <w:r/>
+            <w:r>
+              <w:rPr>
+                <w:sz w:val="17"/>
+              </w:rPr>
+              <w:t>PRIMOPREDAJA</w:t>
             </w:r>
           </w:p>
         </w:tc>
@@ -6664,7 +6467,7 @@
         <w:rPr>
           <w:sz w:val="18"/>
         </w:rPr>
-        <w:t>Sačinio: Rusmir Skopljak, dipl. ing. el.</w:t>
+        <w:t>Autor: Rusmir Skopljak, dipl. ing. el.</w:t>
         <w:br/>
         <w:t>Izvršna direkcija za tehnologiju i razvoj servisa</w:t>
         <w:br/>

</xml_diff>

<commit_message>
Rev 9: battery 6 × 150 Ah (48,6 kWh), as the Odluka states
The Investor confirmed on 11.09.2026 that both sites get 6 × 150 Ah LFP
(48,6 kWh), as in Odluka Aneks 2. The Huawei quote on file (6 × ESM-48100A6,
28,8 kWh, quoted with 540 W modules) is outdated and stays only as a
sensitivity case.

pvsim: kwh_per_module 8,1 with a battery label in both site files; the
report adds the 28,8 kWh sensitivity row. Reports and kpis regenerated for
both sites.

Sjednica, 45°, SMU set per Prilog I: genset 234 h/yr mean (293 h in 9 of
10 years, 313 h worst), 773 l/yr, the 500 l tank refilled about twice a
year (was 284 h / 938 l with 28,8 kWh). Hamzići: 214 h / 706 l.

Propagated to Prilog I §4.6 and §8, 07-proracuni A.5/A.6/C.5/E/F, the
Odluka Aneks 2 sentence (re-applied to the original document), INFO-02,
the 09 decision record, the change log and the checker rules.
check_consistency: only the two estimate placeholders fail.
</commit_message>
<xml_diff>
--- a/bht-sjednica-final-review/TD-OUTPUT/3. Prilog I TD - Specifikacija zahtjeva.docx
+++ b/bht-sjednica-final-review/TD-OUTPUT/3. Prilog I TD - Specifikacija zahtjeva.docx
@@ -5246,7 +5246,7 @@
         <w:t xml:space="preserve"> </w:t>
       </w:r>
       <w:r>
-        <w:t xml:space="preserve">polje; punjenje baterija agregatom do vrha povećava rad agregata za 12–15 %</w:t>
+        <w:t xml:space="preserve">polje; punjenje baterija agregatom do vrha povećava rad agregata za 12–17 %</w:t>
       </w:r>
     </w:p>
     <w:p>
@@ -5264,7 +5264,7 @@
         <w:t xml:space="preserve"> </w:t>
       </w:r>
       <w:r>
-        <w:t xml:space="preserve">najveću vrijednost koju dozvoljava BMS modula ESM-48100A6 (proračun pretpostavlja</w:t>
+        <w:t xml:space="preserve">najveću vrijednost koju dozvoljava BMS baterijskih modula (proračun pretpostavlja</w:t>
       </w:r>
       <w:r>
         <w:t xml:space="preserve"> </w:t>
@@ -6559,7 +6559,7 @@
         <w:t xml:space="preserve"> </w:t>
       </w:r>
       <w:r>
-        <w:t xml:space="preserve">krivulju efikasnosti iSSU S4875G2), baterije 28,8 kWh i agregat preko ispravljača</w:t>
+        <w:t xml:space="preserve">krivulju efikasnosti iSSU S4875G2), baterije 48,6 kWh (6 × 150 Ah) i agregat preko ispravljača</w:t>
       </w:r>
       <w:r>
         <w:t xml:space="preserve"> </w:t>
@@ -6726,7 +6726,7 @@
               <w:pStyle w:val="Compact"/>
             </w:pPr>
             <w:r>
-              <w:t xml:space="preserve">75,5 %</w:t>
+              <w:t xml:space="preserve">79,8 %</w:t>
             </w:r>
           </w:p>
         </w:tc>
@@ -6758,13 +6758,13 @@
                 <w:b/>
                 <w:bCs/>
               </w:rPr>
-              <w:t xml:space="preserve">≈280 h/god</w:t>
+              <w:t xml:space="preserve">≈230 h/god</w:t>
             </w:r>
             <w:r>
               <w:t xml:space="preserve"> </w:t>
             </w:r>
             <w:r>
-              <w:t xml:space="preserve">u prosjeku; u 9 od 10 godina do ≈350 h; najviše ≈360 h</w:t>
+              <w:t xml:space="preserve">u prosjeku; u 9 od 10 godina do ≈290 h; najviše ≈310 h</w:t>
             </w:r>
           </w:p>
         </w:tc>
@@ -6788,7 +6788,7 @@
               <w:pStyle w:val="Compact"/>
             </w:pPr>
             <w:r>
-              <w:t xml:space="preserve">≈165 godišnje, najviše ≈210</w:t>
+              <w:t xml:space="preserve">≈80 godišnje, najviše ≈110</w:t>
             </w:r>
           </w:p>
         </w:tc>
@@ -6820,10 +6820,10 @@
                 <w:b/>
                 <w:bCs/>
               </w:rPr>
-              <w:t xml:space="preserve">≈940 l/god</w:t>
-            </w:r>
-            <w:r>
-              <w:t xml:space="preserve">; spremnik od 500 l dopunjava se dva do tri puta godišnje</w:t>
+              <w:t xml:space="preserve">≈770 l/god</w:t>
+            </w:r>
+            <w:r>
+              <w:t xml:space="preserve">; spremnik od 500 l dopunjava se dva puta godišnje</w:t>
             </w:r>
           </w:p>
         </w:tc>
@@ -6864,7 +6864,7 @@
         <w:t xml:space="preserve"> </w:t>
       </w:r>
       <w:r>
-        <w:t xml:space="preserve">punjenja) agregat bi radio ≈360 h i trošio ≈1 080 l goriva godišnje.</w:t>
+        <w:t xml:space="preserve">punjenja) agregat bi radio ≈260 h i trošio ≈870 l goriva godišnje.</w:t>
       </w:r>
     </w:p>
     <w:p>

</xml_diff>